<commit_message>
Mesh Uploader.docx: fix stale "DAE cannot be previewed" claim
Fred confirmed .dae files DO show in the embedded preview - verified
against FormMesh2Oar.vb (Load3DAssetAsync: isDae toggles webViewDae
Visible, its own live three.js/ColladaLoader panel, never a "cannot
show" case). The claim was wrong from the first draft, carried over
from an old assumption never re-checked against current code.

Removed the false claim in two spots (the GltfViewer paragraph, the
"with the one DAE exception noted above" line) and cleaned up the
"or Mixamo--> DAE including armatures" shorthand note into real prose.

Co-Authored-By: Claude Sonnet 5 <noreply@anthropic.com>
</commit_message>
<xml_diff>
--- a/Mesh Uploader.docx
+++ b/Mesh Uploader.docx
@@ -78,41 +78,7 @@
         <w:rPr>
           <w:lang w:val="en"/>
         </w:rPr>
-        <w:t xml:space="preserve">  -  .</w:t>
-      </w:r>
-      <w:proofErr w:type="spellStart"/>
-      <w:r>
-        <w:rPr>
-          <w:lang w:val="en"/>
-        </w:rPr>
-        <w:t>dae</w:t>
-      </w:r>
-      <w:proofErr w:type="spellEnd"/>
-      <w:r>
-        <w:rPr>
-          <w:lang w:val="en"/>
-        </w:rPr>
-        <w:t xml:space="preserve">   (COLLADA)</w:t>
-      </w:r>
-      <w:r>
-        <w:rPr>
-          <w:lang w:val="en"/>
-        </w:rPr>
-        <w:t xml:space="preserve"> or </w:t>
-      </w:r>
-      <w:proofErr w:type="spellStart"/>
-      <w:r>
-        <w:rPr>
-          <w:lang w:val="en"/>
-        </w:rPr>
-        <w:t>Mixamo</w:t>
-      </w:r>
-      <w:proofErr w:type="spellEnd"/>
-      <w:r>
-        <w:rPr>
-          <w:lang w:val="en"/>
-        </w:rPr>
-        <w:t xml:space="preserve">--&gt; DAE including armatures </w:t>
+        <w:t xml:space="preserve">  -  .dae   (COLLADA), including rigged/Mixamo files with an armature</w:t>
       </w:r>
     </w:p>
     <w:p>
@@ -270,7 +236,7 @@
         <w:rPr>
           <w:lang w:val="en"/>
         </w:rPr>
-        <w:t xml:space="preserve">    For a closer look, click "Preview..." to open the file in the separate, full GltfViewer tool window. This also works for .dae files, which the small embedded panel cannot show.</w:t>
+        <w:t xml:space="preserve">    For a closer look, click "Preview..." to open the file in the separate, full GltfViewer tool window - a more complete standalone viewer, useful for a closer look at any format.</w:t>
       </w:r>
     </w:p>
     <w:p>
@@ -994,21 +960,7 @@
         <w:rPr>
           <w:lang w:val="en"/>
         </w:rPr>
-        <w:t xml:space="preserve">    -  Cannot carry PBR (physically based rendering) material data at all - no normal maps, metallic or roughness data, occlusion, or emissive channels are possible from this format on their own. You can still add a </w:t>
-      </w:r>
-      <w:proofErr w:type="gramStart"/>
-      <w:r>
-        <w:rPr>
-          <w:lang w:val="en"/>
-        </w:rPr>
-        <w:t>Normal</w:t>
-      </w:r>
-      <w:proofErr w:type="gramEnd"/>
-      <w:r>
-        <w:rPr>
-          <w:lang w:val="en"/>
-        </w:rPr>
-        <w:t xml:space="preserve"> map or Gloss map to the object once it is in-world.</w:t>
+        <w:t xml:space="preserve">    -  Cannot carry PBR (physically based rendering) material data at all - no normal maps, metallic or roughness data, occlusion, or emissive channels are possible from this format on their own. You can still add a Normal map or Gloss map to the object once it is in-world.</w:t>
       </w:r>
     </w:p>
     <w:p>
@@ -1074,7 +1026,7 @@
         <w:rPr>
           <w:lang w:val="en"/>
         </w:rPr>
-        <w:t xml:space="preserve">    -  .dae, .gltf, and .glb models all show up in the live embedded 3D preview panel inside the Mesh Uploader window itself (with the one DAE exception noted above).</w:t>
+        <w:t xml:space="preserve">    -  .dae, .gltf, and .glb models all show up in the live embedded 3D preview panel inside the Mesh Uploader window itself.</w:t>
       </w:r>
     </w:p>
     <w:p>

</xml_diff>

<commit_message>
Mesh Uploader.docx: add FBX and armature guidance
- FBX added to the supported formats, the step-by-step text, the format
  comparison, folder batch mode and the recommendations.
- New section "FBX files and armatures": what an armature is, how the
  Clothing and Avatar checkboxes change an FBX import, what DreamGrid
  does behind the scenes for a wearable FBX, the T-pose requirement
  (applies to DAE too), and the old FBX 6 limitation.
- "How to open it" now names the real menu item,
  "Load DAE, GLB, GLTF, FBX".

The .htm export is now stale and needs a fresh export from Word.

Co-Authored-By: Claude Fable 5.1 <noreply@anthropic.com>
</commit_message>
<xml_diff>
--- a/Mesh Uploader.docx
+++ b/Mesh Uploader.docx
@@ -26,7 +26,7 @@
         <w:rPr>
           <w:lang w:val="en"/>
         </w:rPr>
-        <w:t>The Mesh Uploader takes a 3D model file from your computer - a DAE (Collada), GLB, or GLTF file - and puts it straight into a region on your grid, at the spot you choose. You do this without going through a viewer at all. That means no viewer upload limits, no viewer timeouts, and no viewer texture problems getting in your way.</w:t>
+        <w:t>The Mesh Uploader takes a 3D model file from your computer - a DAE (Collada), FBX, GLB, or GLTF file - and puts it straight into a region on your grid, at the spot you choose. You do this without going through a viewer at all. That means no viewer upload limits, no viewer timeouts, and no viewer texture problems getting in your way.</w:t>
       </w:r>
     </w:p>
     <w:p>
@@ -91,6 +91,19 @@
         <w:rPr>
           <w:lang w:val="en"/>
         </w:rPr>
+        <w:t xml:space="preserve">  -  .fbx   (Autodesk FBX, version 7 or newer), including rigged files with an armature</w:t>
+      </w:r>
+    </w:p>
+    <w:p>
+      <w:pPr>
+        <w:rPr>
+          <w:lang w:val="en"/>
+        </w:rPr>
+      </w:pPr>
+      <w:r>
+        <w:rPr>
+          <w:lang w:val="en"/>
+        </w:rPr>
         <w:t xml:space="preserve">  -  .gltf  (glTF, JSON form - textures and binary data are separate side files)</w:t>
       </w:r>
     </w:p>
@@ -131,7 +144,7 @@
         <w:rPr>
           <w:lang w:val="en"/>
         </w:rPr>
-        <w:t>In the main DreamGrid window, go to the Content menu and choose "Mesh Uploader".</w:t>
+        <w:t>In the main DreamGrid window, go to the Content menu and choose "Load DAE, GLB, GLTF, FBX". The Mesh Uploader window opens.</w:t>
       </w:r>
     </w:p>
     <w:p>
@@ -171,7 +184,7 @@
         <w:rPr>
           <w:lang w:val="en"/>
         </w:rPr>
-        <w:t xml:space="preserve">    From the main DreamGrid window: Content menu -&gt; "Mesh Uploader". The Mesh Uploader window opens.</w:t>
+        <w:t xml:space="preserve">    From the main DreamGrid window: Content menu -&gt; "Load DAE, GLB, GLTF, FBX". The Mesh Uploader window opens.</w:t>
       </w:r>
     </w:p>
     <w:p>
@@ -197,7 +210,7 @@
         <w:rPr>
           <w:lang w:val="en"/>
         </w:rPr>
-        <w:t xml:space="preserve">    Click "Browse..." and pick a .dae, .glb, or .gltf file, or type or paste a full file path directly into the "Source model" box.</w:t>
+        <w:t xml:space="preserve">    Click "Browse..." and pick a .dae, .fbx, .glb, or .gltf file, or type or paste a full file path directly into the "Source model" box.</w:t>
       </w:r>
     </w:p>
     <w:p>
@@ -696,6 +709,277 @@
         <w:rPr>
           <w:lang w:val="en"/>
         </w:rPr>
+        <w:t xml:space="preserve">FBX files and armatures</w:t>
+      </w:r>
+    </w:p>
+    <w:p>
+      <w:pPr>
+        <w:rPr>
+          <w:lang w:val="en"/>
+        </w:rPr>
+      </w:pPr>
+      <w:r>
+        <w:rPr>
+          <w:lang w:val="en"/>
+        </w:rPr>
+        <w:t xml:space="preserve">An armature is the skeleton of bones inside a rigged model. It is what lets a worn mesh bend at the elbows and knees along with your avatar. FBX files from Mixamo, Tripo3D, and similar tools often carry one.</w:t>
+      </w:r>
+    </w:p>
+    <w:p>
+      <w:pPr>
+        <w:rPr>
+          <w:lang w:val="en"/>
+        </w:rPr>
+      </w:pPr>
+      <w:r>
+        <w:rPr>
+          <w:lang w:val="en"/>
+        </w:rPr>
+        <w:t xml:space="preserve">The Mesh Uploader reads an FBX file in one of two ways, depending on the Clothing and Avatar checkboxes:</w:t>
+      </w:r>
+    </w:p>
+    <w:p>
+      <w:pPr>
+        <w:rPr>
+          <w:lang w:val="en"/>
+        </w:rPr>
+      </w:pPr>
+      <w:r>
+        <w:rPr>
+          <w:lang w:val="en"/>
+        </w:rPr>
+        <w:t xml:space="preserve">  -  Both boxes unchecked: the armature is ignored. The model loads as an ordinary object, fixed in whatever pose it was saved in. Use this for props, furniture, statues, and buildings.</w:t>
+      </w:r>
+    </w:p>
+    <w:p>
+      <w:pPr>
+        <w:rPr>
+          <w:lang w:val="en"/>
+        </w:rPr>
+      </w:pPr>
+      <w:r>
+        <w:rPr>
+          <w:lang w:val="en"/>
+        </w:rPr>
+        <w:t xml:space="preserve">  -  Clothing or Avatar checked: the armature is kept. The model loads as a wearable, exactly as described in the section above.</w:t>
+      </w:r>
+    </w:p>
+    <w:p>
+      <w:pPr>
+        <w:rPr>
+          <w:lang w:val="en"/>
+        </w:rPr>
+      </w:pPr>
+      <w:r>
+        <w:rPr>
+          <w:lang w:val="en"/>
+        </w:rPr>
+        <w:t xml:space="preserve">For a wearable FBX, DreamGrid does some extra work for you behind the scenes:</w:t>
+      </w:r>
+    </w:p>
+    <w:p>
+      <w:pPr>
+        <w:rPr>
+          <w:lang w:val="en"/>
+        </w:rPr>
+      </w:pPr>
+      <w:r>
+        <w:rPr>
+          <w:lang w:val="en"/>
+        </w:rPr>
+        <w:t xml:space="preserve">  -  It saves a DAE copy of the model, with its textures, in a temporary folder on your computer. Your original FBX file is never changed.</w:t>
+      </w:r>
+    </w:p>
+    <w:p>
+      <w:pPr>
+        <w:rPr>
+          <w:lang w:val="en"/>
+        </w:rPr>
+      </w:pPr>
+      <w:r>
+        <w:rPr>
+          <w:lang w:val="en"/>
+        </w:rPr>
+        <w:t xml:space="preserve">  -  It converts that copy to Second Life bone names, the same way it does for a Mixamo .dae file.</w:t>
+      </w:r>
+    </w:p>
+    <w:p>
+      <w:pPr>
+        <w:rPr>
+          <w:lang w:val="en"/>
+        </w:rPr>
+      </w:pPr>
+      <w:r>
+        <w:rPr>
+          <w:lang w:val="en"/>
+        </w:rPr>
+        <w:t xml:space="preserve">  -  It turns the model to face the right way. Some tools save a model a quarter turn away from what OpenSim expects. You do not need to fix this yourself.</w:t>
+      </w:r>
+    </w:p>
+    <w:p>
+      <w:pPr>
+        <w:rPr>
+          <w:lang w:val="en"/>
+        </w:rPr>
+      </w:pPr>
+      <w:r>
+        <w:rPr>
+          <w:lang w:val="en"/>
+        </w:rPr>
+        <w:t xml:space="preserve">  -  It sizes the model to match the standard avatar skeleton.</w:t>
+      </w:r>
+    </w:p>
+    <w:p>
+      <w:pPr>
+        <w:rPr>
+          <w:lang w:val="en"/>
+        </w:rPr>
+      </w:pPr>
+      <w:r>
+        <w:rPr>
+          <w:lang w:val="en"/>
+        </w:rPr>
+        <w:t xml:space="preserve">The Status box reports these steps as they happen, including the full path of the DAE copy it made.</w:t>
+      </w:r>
+    </w:p>
+    <w:p>
+      <w:pPr>
+        <w:rPr>
+          <w:lang w:val="en"/>
+        </w:rPr>
+      </w:pPr>
+      <w:r>
+        <w:rPr>
+          <w:lang w:val="en"/>
+        </w:rPr>
+        <w:t xml:space="preserve">If you check Clothing or Avatar on an FBX file that has no armature, nothing breaks. The Status box tells you the file has no skeleton, and the model is built as an ordinary object instead.</w:t>
+      </w:r>
+    </w:p>
+    <w:p>
+      <w:pPr>
+        <w:rPr>
+          <w:lang w:val="en"/>
+        </w:rPr>
+      </w:pPr>
+      <w:r>
+        <w:rPr>
+          <w:lang w:val="en"/>
+        </w:rPr>
+        <w:t xml:space="preserve">Wearable FBX files need Python, just like wearable DAE files. See "Python requirement" below.</w:t>
+      </w:r>
+    </w:p>
+    <w:p>
+      <w:pPr>
+        <w:pStyle w:val="Heading3"/>
+        <w:rPr>
+          <w:lang w:val="en"/>
+        </w:rPr>
+      </w:pPr>
+      <w:r>
+        <w:rPr>
+          <w:lang w:val="en"/>
+        </w:rPr>
+        <w:t xml:space="preserve">  The model must be in a T-pose</w:t>
+      </w:r>
+    </w:p>
+    <w:p>
+      <w:pPr>
+        <w:rPr>
+          <w:lang w:val="en"/>
+        </w:rPr>
+      </w:pPr>
+      <w:r>
+        <w:rPr>
+          <w:b/>
+          <w:bCs/>
+          <w:lang w:val="en"/>
+        </w:rPr>
+        <w:t xml:space="preserve">CAUTION: </w:t>
+      </w:r>
+      <w:r>
+        <w:rPr>
+          <w:lang w:val="en"/>
+        </w:rPr>
+        <w:t xml:space="preserve">A model you plan to wear must be rigged standing in a T-pose: upright, legs straight down, both arms held straight out to the sides. This applies to DAE files as well as FBX files.</w:t>
+      </w:r>
+    </w:p>
+    <w:p>
+      <w:pPr>
+        <w:rPr>
+          <w:lang w:val="en"/>
+        </w:rPr>
+      </w:pPr>
+      <w:r>
+        <w:rPr>
+          <w:lang w:val="en"/>
+        </w:rPr>
+        <w:t xml:space="preserve">Second Life and OpenSim animations all start from a T-pose. A model saved in any other pose - arms lowered, body leaning, legs bent - loads and looks correct while it sits in the region as an object. It looks bent or twisted as soon as you wear it, because every animation moves the arms and legs from where a T-pose would have put them.</w:t>
+      </w:r>
+    </w:p>
+    <w:p>
+      <w:pPr>
+        <w:rPr>
+          <w:lang w:val="en"/>
+        </w:rPr>
+      </w:pPr>
+      <w:r>
+        <w:rPr>
+          <w:lang w:val="en"/>
+        </w:rPr>
+        <w:t xml:space="preserve">If you make models with an AI tool such as Tripo3D, choose the T-pose option before you create or rig the model. A character in an action pose makes a fine statue, but not a wearable avatar.</w:t>
+      </w:r>
+    </w:p>
+    <w:p>
+      <w:pPr>
+        <w:rPr>
+          <w:lang w:val="en"/>
+        </w:rPr>
+      </w:pPr>
+      <w:r>
+        <w:rPr>
+          <w:lang w:val="en"/>
+        </w:rPr>
+        <w:t xml:space="preserve">Characters that are not shaped like a person - no legs, a tail, extra arms - may come out taller or shorter than you expect when worn. DreamGrid sets the size from the height of the model’s hips.</w:t>
+      </w:r>
+    </w:p>
+    <w:p>
+      <w:pPr>
+        <w:pStyle w:val="Heading3"/>
+        <w:rPr>
+          <w:lang w:val="en"/>
+        </w:rPr>
+      </w:pPr>
+      <w:r>
+        <w:rPr>
+          <w:lang w:val="en"/>
+        </w:rPr>
+        <w:t xml:space="preserve">  Older FBX files</w:t>
+      </w:r>
+    </w:p>
+    <w:p>
+      <w:pPr>
+        <w:rPr>
+          <w:lang w:val="en"/>
+        </w:rPr>
+      </w:pPr>
+      <w:r>
+        <w:rPr>
+          <w:lang w:val="en"/>
+        </w:rPr>
+        <w:t xml:space="preserve">FBX files saved in the old version 6 format cannot be read. The Status box reports an error saying the format version is not supported. Open the model in the tool that made it and save it again as FBX 7.4 (also called FBX 2014) or newer. Both binary and text (ASCII) FBX files work.</w:t>
+      </w:r>
+    </w:p>
+    <w:p>
+      <w:pPr>
+        <w:pStyle w:val="Heading2"/>
+        <w:rPr>
+          <w:lang w:val="en"/>
+        </w:rPr>
+      </w:pPr>
+      <w:r>
+        <w:rPr>
+          <w:lang w:val="en"/>
+        </w:rPr>
         <w:t>How rig detection works</w:t>
       </w:r>
     </w:p>
@@ -709,7 +993,7 @@
         <w:rPr>
           <w:lang w:val="en"/>
         </w:rPr>
-        <w:t>You do not need to know ahead of time whether a .dae file is a Mixamo rig - the Mesh Uploader checks the file’s own bone names for you. A .dae that is already rigged with Second Life or Avastar bone names (for example, one exported straight from Blender with the Avastar add-on) needs no conversion at all, and builds exactly as before even with Clothing checked. Only a file that actually contains Mixamo-style bone names ("mixamorig_...") goes through the conversion step. This means it is safe to leave Clothing checked as your default - it has no effect on a file that does not need it.</w:t>
+        <w:t>You do not need to know ahead of time whether a .dae or .fbx file is a Mixamo rig - the Mesh Uploader checks the file’s own bone names for you. A .dae that is already rigged with Second Life or Avastar bone names (for example, one exported straight from Blender with the Avastar add-on) needs no conversion at all, and builds exactly as before even with Clothing checked. Only a file that actually contains Mixamo-style bone names ("mixamorig_...") goes through the conversion step. This means it is safe to leave Clothing checked as your default - it has no effect on a file that does not need it.</w:t>
       </w:r>
     </w:p>
     <w:p>
@@ -907,20 +1191,20 @@
         <w:rPr>
           <w:lang w:val="en"/>
         </w:rPr>
-        <w:t>DAE, GLTF, and GLB - what is different</w:t>
-      </w:r>
-    </w:p>
-    <w:p>
-      <w:pPr>
-        <w:rPr>
-          <w:lang w:val="en"/>
-        </w:rPr>
-      </w:pPr>
-      <w:r>
-        <w:rPr>
-          <w:lang w:val="en"/>
-        </w:rPr>
-        <w:t>All three formats go through the same OAR-building steps and follow the same vertex and material rules described below, but they are read by different code internally, and one feature is GLTF/GLB only:</w:t>
+        <w:t>DAE, FBX, GLTF, and GLB - what is different</w:t>
+      </w:r>
+    </w:p>
+    <w:p>
+      <w:pPr>
+        <w:rPr>
+          <w:lang w:val="en"/>
+        </w:rPr>
+      </w:pPr>
+      <w:r>
+        <w:rPr>
+          <w:lang w:val="en"/>
+        </w:rPr>
+        <w:t>All four formats go through the same OAR-building steps and follow the same vertex and material rules described below, but they are read by different code internally, and one feature is GLTF/GLB only:</w:t>
       </w:r>
     </w:p>
     <w:p>
@@ -974,6 +1258,72 @@
         <w:rPr>
           <w:lang w:val="en"/>
         </w:rPr>
+        <w:t xml:space="preserve">  FBX</w:t>
+      </w:r>
+    </w:p>
+    <w:p>
+      <w:pPr>
+        <w:rPr>
+          <w:lang w:val="en"/>
+        </w:rPr>
+      </w:pPr>
+      <w:r>
+        <w:rPr>
+          <w:lang w:val="en"/>
+        </w:rPr>
+        <w:t xml:space="preserve">    -  Uses the same simple diffuse color/texture material model as DAE. No PBR material data is carried across.</w:t>
+      </w:r>
+    </w:p>
+    <w:p>
+      <w:pPr>
+        <w:rPr>
+          <w:lang w:val="en"/>
+        </w:rPr>
+      </w:pPr>
+      <w:r>
+        <w:rPr>
+          <w:lang w:val="en"/>
+        </w:rPr>
+        <w:t xml:space="preserve">    -  Textures packed inside the FBX file itself are read straight from the file. Textures saved as separate files are read from where the FBX says they are.</w:t>
+      </w:r>
+    </w:p>
+    <w:p>
+      <w:pPr>
+        <w:rPr>
+          <w:lang w:val="en"/>
+        </w:rPr>
+      </w:pPr>
+      <w:r>
+        <w:rPr>
+          <w:lang w:val="en"/>
+        </w:rPr>
+        <w:t xml:space="preserve">    -  Sizes are converted to meters automatically, whatever unit the file was saved in.</w:t>
+      </w:r>
+    </w:p>
+    <w:p>
+      <w:pPr>
+        <w:rPr>
+          <w:lang w:val="en"/>
+        </w:rPr>
+      </w:pPr>
+      <w:r>
+        <w:rPr>
+          <w:lang w:val="en"/>
+        </w:rPr>
+        <w:t xml:space="preserve">    -  Can carry an armature. See "FBX files and armatures" above.</w:t>
+      </w:r>
+    </w:p>
+    <w:p>
+      <w:pPr>
+        <w:pStyle w:val="Heading3"/>
+        <w:rPr>
+          <w:lang w:val="en"/>
+        </w:rPr>
+      </w:pPr>
+      <w:r>
+        <w:rPr>
+          <w:lang w:val="en"/>
+        </w:rPr>
         <w:t xml:space="preserve">  GLTF (.gltf, JSON plus side files) and GLB (.glb, one packed file)</w:t>
       </w:r>
     </w:p>
@@ -1026,7 +1376,7 @@
         <w:rPr>
           <w:lang w:val="en"/>
         </w:rPr>
-        <w:t xml:space="preserve">    -  .dae, .gltf, and .glb models all show up in the live embedded 3D preview panel inside the Mesh Uploader window itself.</w:t>
+        <w:t xml:space="preserve">    -  .dae, .fbx, .gltf, and .glb models all show up in the live embedded 3D preview panel inside the Mesh Uploader window itself.</w:t>
       </w:r>
     </w:p>
     <w:p>
@@ -1067,7 +1417,33 @@
         <w:rPr>
           <w:lang w:val="en"/>
         </w:rPr>
-        <w:t xml:space="preserve">  -  Raw Mixamo exports (.dae downloaded directly from the Mixamo website): use Clothing or Avatar as needed. These are the file DreamGrid’s Mixamo conversion is built and tested against, and they work well end to end.</w:t>
+        <w:t xml:space="preserve">  -  Raw Mixamo exports (.dae or .fbx downloaded directly from the Mixamo website): use Clothing or Avatar as needed. These are the file DreamGrid’s Mixamo conversion is built and tested against, and they work well end to end.</w:t>
+      </w:r>
+    </w:p>
+    <w:p>
+      <w:pPr>
+        <w:rPr>
+          <w:lang w:val="en"/>
+        </w:rPr>
+      </w:pPr>
+      <w:r>
+        <w:rPr>
+          <w:lang w:val="en"/>
+        </w:rPr>
+        <w:t xml:space="preserve">  -  Mixamo .dae or .fbx - which to pick: both work. One Mixamo character was seen with its eyes out of place in the .dae download and correct in the .fbx download. If a .dae looks wrong, try the .fbx of the same character.</w:t>
+      </w:r>
+    </w:p>
+    <w:p>
+      <w:pPr>
+        <w:rPr>
+          <w:lang w:val="en"/>
+        </w:rPr>
+      </w:pPr>
+      <w:r>
+        <w:rPr>
+          <w:lang w:val="en"/>
+        </w:rPr>
+        <w:t xml:space="preserve">  -  Tripo3D and other AI model generators (.fbx): supported, including rigged models. Create the model in a T-pose if you plan to wear it - see "FBX files and armatures" above.</w:t>
       </w:r>
     </w:p>
     <w:p>
@@ -1277,7 +1653,7 @@
         <w:rPr>
           <w:lang w:val="en"/>
         </w:rPr>
-        <w:t>Check "Process entire folder (one mesh at a time)" and the Browse button switches to picking a FOLDER instead of a single file. Clicking "Build &amp;&amp; Load" then scans that folder, and every subfolder, for every .dae, .gltf, or .glb file it can find, and builds and loads them one at a time, in alphabetical order, each into its own OAR.</w:t>
+        <w:t>Check "Process entire folder (one mesh at a time)" and the Browse button switches to picking a FOLDER instead of a single file. Clicking "Build &amp;&amp; Load" then scans that folder, and every subfolder, for every .dae, .fbx, .gltf, or .glb file it can find, and builds and loads them one at a time, in alphabetical order, each into its own OAR.</w:t>
       </w:r>
     </w:p>
     <w:p>
@@ -1423,6 +1799,19 @@
           <w:lang w:val="en"/>
         </w:rPr>
         <w:t xml:space="preserve">  -  Leave Clothing checked by default if you plan to upload Mixamo characters - it has no effect on a file that does not need converting, and saves you a step on the ones that do.</w:t>
+      </w:r>
+    </w:p>
+    <w:p>
+      <w:pPr>
+        <w:rPr>
+          <w:lang w:val="en"/>
+        </w:rPr>
+      </w:pPr>
+      <w:r>
+        <w:rPr>
+          <w:lang w:val="en"/>
+        </w:rPr>
+        <w:t xml:space="preserve">  -  Planning to wear it? Check that the model is in a T-pose before anything else. No setting in DreamGrid can fix a model that was rigged in another pose.</w:t>
       </w:r>
     </w:p>
     <w:sectPr>

</xml_diff>

<commit_message>
Mesh Uploader, Users: letting users upload mesh from the web
DreamGrid can now let users upload mesh from its web page (DreamGrid
commit b800bef0).

Mesh Uploader.docx: new section "Letting users upload mesh from the
web" - the two steps to switch it on, who can upload and where (own or
managed estates; administrators anywhere), what the user does, the
limits, and a CAUTION to tick only trusted users.

Users.docx: what the "Web mesh upload" box does, and a CAUTION that the
master switch on the Mesh Uploader window is needed too.

Both .htm exports are now out of date.

Co-Authored-By: Claude Fable 5.1 <noreply@anthropic.com>
</commit_message>
<xml_diff>
--- a/Mesh Uploader.docx
+++ b/Mesh Uploader.docx
@@ -1631,6 +1631,334 @@
           <w:lang w:val="en"/>
         </w:rPr>
         <w:t xml:space="preserve">  -  Practical target: split a detailed model across up to 8 materials, so each one stays comfortably under both numbers.</w:t>
+      </w:r>
+    </w:p>
+    <w:p>
+      <w:pPr>
+        <w:pStyle w:val="Heading2"/>
+        <w:keepNext/>
+        <w:rPr>
+          <w:lang w:val="en"/>
+        </w:rPr>
+      </w:pPr>
+      <w:r>
+        <w:rPr>
+          <w:lang w:val="en"/>
+        </w:rPr>
+        <w:t xml:space="preserve">Letting users upload mesh from the web</w:t>
+      </w:r>
+    </w:p>
+    <w:p>
+      <w:pPr>
+        <w:rPr>
+          <w:lang w:val="en"/>
+        </w:rPr>
+      </w:pPr>
+      <w:r>
+        <w:rPr>
+          <w:lang w:val="en"/>
+        </w:rPr>
+        <w:t xml:space="preserve">Your users can upload their own mesh from a web page, without sitting at the DreamGrid computer. The mesh appears in world about 2 meters in front of where their avatar is standing. It belongs to the user who uploaded it.</w:t>
+      </w:r>
+    </w:p>
+    <w:p>
+      <w:pPr>
+        <w:rPr>
+          <w:lang w:val="en"/>
+        </w:rPr>
+      </w:pPr>
+      <w:r>
+        <w:rPr>
+          <w:lang w:val="en"/>
+        </w:rPr>
+        <w:t xml:space="preserve">This is switched off when DreamGrid is installed. To switch it on, do both of these steps:</w:t>
+      </w:r>
+    </w:p>
+    <w:p>
+      <w:pPr>
+        <w:rPr>
+          <w:lang w:val="en"/>
+        </w:rPr>
+      </w:pPr>
+      <w:r>
+        <w:rPr>
+          <w:lang w:val="en"/>
+        </w:rPr>
+        <w:t xml:space="preserve">  -  On the Mesh Uploader window, tick “Let users upload mesh from the web”. This is the master switch for the whole grid.</w:t>
+      </w:r>
+    </w:p>
+    <w:p>
+      <w:pPr>
+        <w:rPr>
+          <w:lang w:val="en"/>
+        </w:rPr>
+      </w:pPr>
+      <w:r>
+        <w:rPr>
+          <w:lang w:val="en"/>
+        </w:rPr>
+        <w:t xml:space="preserve">  -  Open each user you want to allow, and tick “Web mesh upload” on their Edit screen.</w:t>
+      </w:r>
+    </w:p>
+    <w:p>
+      <w:pPr>
+        <w:rPr>
+          <w:lang w:val="en"/>
+        </w:rPr>
+      </w:pPr>
+      <w:r>
+        <w:rPr>
+          <w:lang w:val="en"/>
+        </w:rPr>
+        <w:t xml:space="preserve">Untick the master switch to stop it for everyone at once.</w:t>
+      </w:r>
+    </w:p>
+    <w:p>
+      <w:pPr>
+        <w:pStyle w:val="Heading3"/>
+        <w:keepNext/>
+        <w:rPr>
+          <w:lang w:val="en"/>
+        </w:rPr>
+      </w:pPr>
+      <w:r>
+        <w:rPr>
+          <w:lang w:val="en"/>
+        </w:rPr>
+        <w:t xml:space="preserve">  Who can upload, and where</w:t>
+      </w:r>
+    </w:p>
+    <w:p>
+      <w:pPr>
+        <w:rPr>
+          <w:lang w:val="en"/>
+        </w:rPr>
+      </w:pPr>
+      <w:r>
+        <w:rPr>
+          <w:lang w:val="en"/>
+        </w:rPr>
+        <w:t xml:space="preserve">A user who is ticked can only upload into a region whose estate they own or manage. This stops anyone from dropping a mesh into a region that belongs to somebody else.</w:t>
+      </w:r>
+    </w:p>
+    <w:p>
+      <w:pPr>
+        <w:rPr>
+          <w:lang w:val="en"/>
+        </w:rPr>
+      </w:pPr>
+      <w:r>
+        <w:rPr>
+          <w:lang w:val="en"/>
+        </w:rPr>
+        <w:t xml:space="preserve">Grid administrators can upload into any region, and do not need to be ticked. The master switch must still be on.</w:t>
+      </w:r>
+    </w:p>
+    <w:p>
+      <w:pPr>
+        <w:pStyle w:val="Heading3"/>
+        <w:keepNext/>
+        <w:rPr>
+          <w:lang w:val="en"/>
+        </w:rPr>
+      </w:pPr>
+      <w:r>
+        <w:rPr>
+          <w:lang w:val="en"/>
+        </w:rPr>
+        <w:t xml:space="preserve">  What the user does</w:t>
+      </w:r>
+    </w:p>
+    <w:p>
+      <w:pPr>
+        <w:rPr>
+          <w:lang w:val="en"/>
+        </w:rPr>
+      </w:pPr>
+      <w:r>
+        <w:rPr>
+          <w:lang w:val="en"/>
+        </w:rPr>
+        <w:t xml:space="preserve">  1.  Log in to the grid with a viewer, and stand where the mesh should go.</w:t>
+      </w:r>
+    </w:p>
+    <w:p>
+      <w:pPr>
+        <w:rPr>
+          <w:lang w:val="en"/>
+        </w:rPr>
+      </w:pPr>
+      <w:r>
+        <w:rPr>
+          <w:lang w:val="en"/>
+        </w:rPr>
+        <w:t xml:space="preserve">  2.  Open the DreamGrid web control page (the page with the Start and Stop buttons), log in there with the avatar name and password, and click “Upload Mesh”.</w:t>
+      </w:r>
+    </w:p>
+    <w:p>
+      <w:pPr>
+        <w:rPr>
+          <w:lang w:val="en"/>
+        </w:rPr>
+      </w:pPr>
+      <w:r>
+        <w:rPr>
+          <w:lang w:val="en"/>
+        </w:rPr>
+        <w:t xml:space="preserve">  3.  The page shows which region the avatar is in, with a red dot on the region map where the mesh will go.</w:t>
+      </w:r>
+    </w:p>
+    <w:p>
+      <w:pPr>
+        <w:rPr>
+          <w:lang w:val="en"/>
+        </w:rPr>
+      </w:pPr>
+      <w:r>
+        <w:rPr>
+          <w:lang w:val="en"/>
+        </w:rPr>
+        <w:t xml:space="preserve">  4.  Choose the model file and its texture files together. The model turns in a 3D preview. If a texture was left out, the page names it.</w:t>
+      </w:r>
+    </w:p>
+    <w:p>
+      <w:pPr>
+        <w:rPr>
+          <w:lang w:val="en"/>
+        </w:rPr>
+      </w:pPr>
+      <w:r>
+        <w:rPr>
+          <w:lang w:val="en"/>
+        </w:rPr>
+        <w:t xml:space="preserve">  5.  Choose Object, Clothing or Avatar. These mean the same as leaving both checkboxes off, ticking Clothing, or ticking Avatar on the Mesh Uploader window.</w:t>
+      </w:r>
+    </w:p>
+    <w:p>
+      <w:pPr>
+        <w:rPr>
+          <w:lang w:val="en"/>
+        </w:rPr>
+      </w:pPr>
+      <w:r>
+        <w:rPr>
+          <w:lang w:val="en"/>
+        </w:rPr>
+        <w:t xml:space="preserve">  6.  Click “Upload and place in world”, and watch the progress lines.</w:t>
+      </w:r>
+    </w:p>
+    <w:p>
+      <w:pPr>
+        <w:rPr>
+          <w:lang w:val="en"/>
+        </w:rPr>
+      </w:pPr>
+      <w:r>
+        <w:rPr>
+          <w:lang w:val="en"/>
+        </w:rPr>
+        <w:t xml:space="preserve">To wear clothing or an avatar, the user right-clicks the object in world, chooses Take, then wears it from their inventory.</w:t>
+      </w:r>
+    </w:p>
+    <w:p>
+      <w:pPr>
+        <w:pStyle w:val="Heading3"/>
+        <w:keepNext/>
+        <w:rPr>
+          <w:lang w:val="en"/>
+        </w:rPr>
+      </w:pPr>
+      <w:r>
+        <w:rPr>
+          <w:lang w:val="en"/>
+        </w:rPr>
+        <w:t xml:space="preserve">  Limits</w:t>
+      </w:r>
+    </w:p>
+    <w:p>
+      <w:pPr>
+        <w:rPr>
+          <w:lang w:val="en"/>
+        </w:rPr>
+      </w:pPr>
+      <w:r>
+        <w:rPr>
+          <w:lang w:val="en"/>
+        </w:rPr>
+        <w:t xml:space="preserve">  -  One upload can hold up to 200 MB and 40 files.</w:t>
+      </w:r>
+    </w:p>
+    <w:p>
+      <w:pPr>
+        <w:rPr>
+          <w:lang w:val="en"/>
+        </w:rPr>
+      </w:pPr>
+      <w:r>
+        <w:rPr>
+          <w:lang w:val="en"/>
+        </w:rPr>
+        <w:t xml:space="preserve">  -  A mesh larger than 64 meters on its longest side is made smaller to fit.</w:t>
+      </w:r>
+    </w:p>
+    <w:p>
+      <w:pPr>
+        <w:rPr>
+          <w:lang w:val="en"/>
+        </w:rPr>
+      </w:pPr>
+      <w:r>
+        <w:rPr>
+          <w:lang w:val="en"/>
+        </w:rPr>
+        <w:t xml:space="preserve">  -  Only one mesh is built at a time. A user may wait a short while if someone else is uploading, or if you are using the Mesh Uploader window yourself.</w:t>
+      </w:r>
+    </w:p>
+    <w:p>
+      <w:pPr>
+        <w:rPr>
+          <w:lang w:val="en"/>
+        </w:rPr>
+      </w:pPr>
+      <w:r>
+        <w:rPr>
+          <w:lang w:val="en"/>
+        </w:rPr>
+        <w:t xml:space="preserve">  -  Clothing and Avatar need Python on the DreamGrid computer, the same as on the Mesh Uploader window. Without it the page offers Object only.</w:t>
+      </w:r>
+    </w:p>
+    <w:p>
+      <w:pPr>
+        <w:rPr>
+          <w:lang w:val="en"/>
+        </w:rPr>
+      </w:pPr>
+      <w:r>
+        <w:rPr>
+          <w:lang w:val="en"/>
+        </w:rPr>
+        <w:t xml:space="preserve">Uploaded files are kept in a folder that cannot be reached from the web. They are deleted when the build ends.</w:t>
+      </w:r>
+    </w:p>
+    <w:p>
+      <w:pPr>
+        <w:rPr>
+          <w:lang w:val="en"/>
+        </w:rPr>
+      </w:pPr>
+      <w:r>
+        <w:rPr>
+          <w:b/>
+          <w:bCs/>
+          <w:lang w:val="en"/>
+        </w:rPr>
+        <w:t xml:space="preserve">CAUTION: </w:t>
+      </w:r>
+      <w:r>
+        <w:rPr>
+          <w:lang w:val="en"/>
+        </w:rPr>
+        <w:t xml:space="preserve">Only tick users you trust. DreamGrid itself reads the model file, and a badly damaged file could stop DreamGrid.</w:t>
       </w:r>
     </w:p>
     <w:p>

</xml_diff>

<commit_message>
Mesh Uploader: Physics section (how avatars bump into it)
Co-Authored-By: Claude Opus 5.5 <noreply@anthropic.com>
</commit_message>
<xml_diff>
--- a/Mesh Uploader.docx
+++ b/Mesh Uploader.docx
@@ -583,6 +583,153 @@
           <w:lang w:val="en"/>
         </w:rPr>
         <w:t xml:space="preserve">    The button is disabled while a build is running. Wait for it to finish, or fail, before starting another.</w:t>
+      </w:r>
+    </w:p>
+    <w:p>
+      <w:pPr>
+        <w:pStyle w:val="Heading2"/>
+        <w:rPr>
+          <w:lang w:val="en"/>
+        </w:rPr>
+      </w:pPr>
+      <w:r>
+        <w:rPr>
+          <w:lang w:val="en"/>
+        </w:rPr>
+        <w:t xml:space="preserve">Physics - how avatars bump into it</w:t>
+      </w:r>
+    </w:p>
+    <w:p>
+      <w:pPr>
+        <w:rPr>
+          <w:b/>
+          <w:bCs/>
+          <w:lang w:val="en"/>
+        </w:rPr>
+      </w:pPr>
+      <w:r>
+        <w:rPr>
+          <w:lang w:val="en"/>
+        </w:rPr>
+        <w:t xml:space="preserve">The “Physics” list, next to “Loop animation”, decides what solid shape OpenSim uses when an avatar walks into the object or something falls on it. It does not change how the object looks - only what you bump into.</w:t>
+      </w:r>
+    </w:p>
+    <w:p>
+      <w:pPr>
+        <w:rPr>
+          <w:lang w:val="en"/>
+        </w:rPr>
+      </w:pPr>
+      <w:r>
+        <w:rPr>
+          <w:lang w:val="en"/>
+        </w:rPr>
+        <w:t xml:space="preserve">  -  How it looks (the default) - the object is as solid as it looks. You can walk through its doorways and under its arches. This works with both physics engines, ubODE and Bullet.</w:t>
+      </w:r>
+    </w:p>
+    <w:p>
+      <w:pPr>
+        <w:rPr>
+          <w:lang w:val="en"/>
+        </w:rPr>
+      </w:pPr>
+      <w:r>
+        <w:rPr>
+          <w:lang w:val="en"/>
+        </w:rPr>
+        <w:t xml:space="preserve">  -  Convex hull - one tight skin wrapped around each part, like shrink-wrap. Doorways and hollows are filled in. It is lighter work for the physics engine, and good for rocks, furniture and vehicles.</w:t>
+      </w:r>
+    </w:p>
+    <w:p>
+      <w:pPr>
+        <w:rPr>
+          <w:lang w:val="en"/>
+        </w:rPr>
+      </w:pPr>
+      <w:r>
+        <w:rPr>
+          <w:lang w:val="en"/>
+        </w:rPr>
+        <w:t xml:space="preserve">  -  Box per part - a box around each part.</w:t>
+      </w:r>
+    </w:p>
+    <w:p>
+      <w:pPr>
+        <w:rPr>
+          <w:lang w:val="en"/>
+        </w:rPr>
+      </w:pPr>
+      <w:r>
+        <w:rPr>
+          <w:lang w:val="en"/>
+        </w:rPr>
+        <w:t xml:space="preserve">  -  One box - one box around the whole object. The other parts have no physics at all.</w:t>
+      </w:r>
+    </w:p>
+    <w:p>
+      <w:pPr>
+        <w:rPr>
+          <w:lang w:val="en"/>
+        </w:rPr>
+      </w:pPr>
+      <w:r>
+        <w:rPr>
+          <w:lang w:val="en"/>
+        </w:rPr>
+        <w:t xml:space="preserve">  -  Hexagon - like One box, but a six-sided column. Good for round things such as trees and towers.</w:t>
+      </w:r>
+    </w:p>
+    <w:p>
+      <w:pPr>
+        <w:rPr>
+          <w:b/>
+          <w:bCs/>
+          <w:lang w:val="en"/>
+        </w:rPr>
+      </w:pPr>
+      <w:r>
+        <w:rPr>
+          <w:lang w:val="en"/>
+        </w:rPr>
+        <w:t xml:space="preserve">Your choice is remembered for the next upload. The web upload page has the same list.</w:t>
+      </w:r>
+    </w:p>
+    <w:p>
+      <w:pPr>
+        <w:rPr>
+          <w:b/>
+          <w:bCs/>
+          <w:lang w:val="en"/>
+        </w:rPr>
+      </w:pPr>
+      <w:r>
+        <w:rPr>
+          <w:lang w:val="en"/>
+        </w:rPr>
+        <w:t xml:space="preserve">Clothing and avatars always get a convex hull, the same as an upload from the viewer. Physics does not matter for something you wear.</w:t>
+      </w:r>
+    </w:p>
+    <w:p>
+      <w:pPr>
+        <w:rPr>
+          <w:b/>
+          <w:bCs/>
+          <w:lang w:val="en"/>
+        </w:rPr>
+      </w:pPr>
+      <w:r>
+        <w:rPr>
+          <w:b/>
+          <w:bCs/>
+          <w:lang w:val="en"/>
+        </w:rPr>
+        <w:t xml:space="preserve">CAUTION:</w:t>
+      </w:r>
+      <w:r>
+        <w:rPr>
+          <w:lang w:val="en"/>
+        </w:rPr>
+        <w:t xml:space="preserve"> How it looks is the most work for the physics engine on a very detailed model. If a big, detailed object makes the region slow, upload it again with Convex hull or One box.</w:t>
       </w:r>
     </w:p>
     <w:p>

</xml_diff>

<commit_message>
Mesh Uploader: Levels of detail section (LOD... button)
Co-Authored-By: Claude Opus 5.5 <noreply@anthropic.com>
</commit_message>
<xml_diff>
--- a/Mesh Uploader.docx
+++ b/Mesh Uploader.docx
@@ -730,6 +730,132 @@
           <w:lang w:val="en"/>
         </w:rPr>
         <w:t xml:space="preserve"> How it looks is the most work for the physics engine on a very detailed model. If a big, detailed object makes the region slow, upload it again with Convex hull or One box.</w:t>
+      </w:r>
+    </w:p>
+    <w:p>
+      <w:pPr>
+        <w:pStyle w:val="Heading2"/>
+        <w:rPr>
+          <w:lang w:val="en"/>
+        </w:rPr>
+      </w:pPr>
+      <w:r>
+        <w:rPr>
+          <w:lang w:val="en"/>
+        </w:rPr>
+        <w:t xml:space="preserve">Levels of detail - the “LOD...” button</w:t>
+      </w:r>
+    </w:p>
+    <w:p>
+      <w:pPr>
+        <w:rPr>
+          <w:b/>
+          <w:bCs/>
+          <w:lang w:val="en"/>
+        </w:rPr>
+      </w:pPr>
+      <w:r>
+        <w:rPr>
+          <w:lang w:val="en"/>
+        </w:rPr>
+        <w:t xml:space="preserve">Viewers draw an object with less detail when it is far away, so a busy region stays fast. A mesh carries four versions of itself for this: High (the model as you made it), Medium, Low and Lowest. The Mesh Uploader makes Medium, Low and Lowest for you.</w:t>
+      </w:r>
+    </w:p>
+    <w:p>
+      <w:pPr>
+        <w:rPr>
+          <w:b/>
+          <w:bCs/>
+          <w:lang w:val="en"/>
+        </w:rPr>
+      </w:pPr>
+      <w:r>
+        <w:rPr>
+          <w:lang w:val="en"/>
+        </w:rPr>
+        <w:t xml:space="preserve">Click “LOD...”, next to “Preview...”, to change how they are made. Each of the three levels has a choice:</w:t>
+      </w:r>
+    </w:p>
+    <w:p>
+      <w:pPr>
+        <w:rPr>
+          <w:lang w:val="en"/>
+        </w:rPr>
+      </w:pPr>
+      <w:r>
+        <w:rPr>
+          <w:lang w:val="en"/>
+        </w:rPr>
+        <w:t xml:space="preserve">  -  Generate Auto (the default) - DreamGrid makes a simpler copy of the High model, the same way the Firestorm viewer does when you upload there.</w:t>
+      </w:r>
+    </w:p>
+    <w:p>
+      <w:pPr>
+        <w:rPr>
+          <w:lang w:val="en"/>
+        </w:rPr>
+      </w:pPr>
+      <w:r>
+        <w:rPr>
+          <w:lang w:val="en"/>
+        </w:rPr>
+        <w:t xml:space="preserve">  -  Use LOD above - the level is a copy of the one above it. Use this if the automatic copy looks wrong from a distance.</w:t>
+      </w:r>
+    </w:p>
+    <w:p>
+      <w:pPr>
+        <w:rPr>
+          <w:b/>
+          <w:bCs/>
+          <w:lang w:val="en"/>
+        </w:rPr>
+      </w:pPr>
+      <w:r>
+        <w:rPr>
+          <w:lang w:val="en"/>
+        </w:rPr>
+        <w:t xml:space="preserve">With Generate Auto you can set how much detail to keep:</w:t>
+      </w:r>
+    </w:p>
+    <w:p>
+      <w:pPr>
+        <w:rPr>
+          <w:lang w:val="en"/>
+        </w:rPr>
+      </w:pPr>
+      <w:r>
+        <w:rPr>
+          <w:lang w:val="en"/>
+        </w:rPr>
+        <w:t xml:space="preserve">  -  Triangle limit - the most triangles the level may have. Leave it at 0 to use the viewer’s own default: the High model’s triangles divided by 3 for Medium, by 9 for Low and by 27 for Lowest.</w:t>
+      </w:r>
+    </w:p>
+    <w:p>
+      <w:pPr>
+        <w:rPr>
+          <w:lang w:val="en"/>
+        </w:rPr>
+      </w:pPr>
+      <w:r>
+        <w:rPr>
+          <w:lang w:val="en"/>
+        </w:rPr>
+        <w:t xml:space="preserve">  -  Error threshold % - how far the simpler copy may move away from the High model’s shape, as a percent of the model’s size. A small number keeps more detail.</w:t>
+      </w:r>
+    </w:p>
+    <w:p>
+      <w:pPr>
+        <w:rPr>
+          <w:b/>
+          <w:bCs/>
+          <w:lang w:val="en"/>
+        </w:rPr>
+      </w:pPr>
+      <w:r>
+        <w:rPr>
+          <w:lang w:val="en"/>
+        </w:rPr>
+        <w:t xml:space="preserve">A level never gets more detail than the one above it; if it would, it becomes a copy of the level above. Your choices are remembered for the next upload. The web upload page has the same settings under “Advanced: levels of detail”.</w:t>
       </w:r>
     </w:p>
     <w:p>

</xml_diff>

<commit_message>
Mesh Uploader: Fred's Word save after the Physics and LOD sections
Co-Authored-By: Claude Opus 5.5 <noreply@anthropic.com>
</commit_message>
<xml_diff>
--- a/Mesh Uploader.docx
+++ b/Mesh Uploader.docx
@@ -53,11 +53,73 @@
         <w:rPr>
           <w:lang w:val="en"/>
         </w:rPr>
-        <w:t>You do not need to be logged in as an avatar to use this. You do not need the model to already exist anywhere in-world. You can also aim the upload at wherever any avatar online right now is standing and looking, which is the fastest way to drop something exactly where you want it.</w:t>
-      </w:r>
-    </w:p>
-    <w:p>
-      <w:pPr>
+        <w:drawing>
+          <wp:inline distT="0" distB="0" distL="0" distR="0" wp14:anchorId="71CDFD3B" wp14:editId="5873E0E3">
+            <wp:extent cx="5943600" cy="3559175"/>
+            <wp:effectExtent l="0" t="0" r="0" b="0"/>
+            <wp:docPr id="642149571" name="Picture 1"/>
+            <wp:cNvGraphicFramePr>
+              <a:graphicFrameLocks xmlns:a="http://schemas.openxmlformats.org/drawingml/2006/main" noChangeAspect="1"/>
+            </wp:cNvGraphicFramePr>
+            <a:graphic xmlns:a="http://schemas.openxmlformats.org/drawingml/2006/main">
+              <a:graphicData uri="http://schemas.openxmlformats.org/drawingml/2006/picture">
+                <pic:pic xmlns:pic="http://schemas.openxmlformats.org/drawingml/2006/picture">
+                  <pic:nvPicPr>
+                    <pic:cNvPr id="642149571" name=""/>
+                    <pic:cNvPicPr/>
+                  </pic:nvPicPr>
+                  <pic:blipFill>
+                    <a:blip r:embed="rId4"/>
+                    <a:stretch>
+                      <a:fillRect/>
+                    </a:stretch>
+                  </pic:blipFill>
+                  <pic:spPr>
+                    <a:xfrm>
+                      <a:off x="0" y="0"/>
+                      <a:ext cx="5943600" cy="3559175"/>
+                    </a:xfrm>
+                    <a:prstGeom prst="rect">
+                      <a:avLst/>
+                    </a:prstGeom>
+                  </pic:spPr>
+                </pic:pic>
+              </a:graphicData>
+            </a:graphic>
+          </wp:inline>
+        </w:drawing>
+      </w:r>
+    </w:p>
+    <w:p>
+      <w:pPr>
+        <w:rPr>
+          <w:lang w:val="en"/>
+        </w:rPr>
+      </w:pPr>
+      <w:r>
+        <w:rPr>
+          <w:lang w:val="en"/>
+        </w:rPr>
+        <w:t xml:space="preserve">You do not need to be logged in as an avatar to use this. You do not need the model to already exist anywhere in-world. You can also aim </w:t>
+      </w:r>
+      <w:proofErr w:type="gramStart"/>
+      <w:r>
+        <w:rPr>
+          <w:lang w:val="en"/>
+        </w:rPr>
+        <w:t>the upload</w:t>
+      </w:r>
+      <w:proofErr w:type="gramEnd"/>
+      <w:r>
+        <w:rPr>
+          <w:lang w:val="en"/>
+        </w:rPr>
+        <w:t xml:space="preserve"> at wherever any avatar online right now is standing and looking, which is the fastest way to drop something exactly where you want it.</w:t>
+      </w:r>
+    </w:p>
+    <w:p>
+      <w:pPr>
+        <w:ind w:left="540" w:hanging="630"/>
         <w:rPr>
           <w:lang w:val="en"/>
         </w:rPr>
@@ -71,6 +133,9 @@
     </w:p>
     <w:p>
       <w:pPr>
+        <w:spacing w:before="0"/>
+        <w:ind w:left="540" w:hanging="630"/>
+        <w:jc w:val="both"/>
         <w:rPr>
           <w:lang w:val="en"/>
         </w:rPr>
@@ -84,6 +149,9 @@
     </w:p>
     <w:p>
       <w:pPr>
+        <w:spacing w:before="0"/>
+        <w:ind w:left="540" w:hanging="630"/>
+        <w:jc w:val="both"/>
         <w:rPr>
           <w:lang w:val="en"/>
         </w:rPr>
@@ -97,19 +165,53 @@
     </w:p>
     <w:p>
       <w:pPr>
-        <w:rPr>
-          <w:lang w:val="en"/>
-        </w:rPr>
-      </w:pPr>
-      <w:r>
-        <w:rPr>
-          <w:lang w:val="en"/>
-        </w:rPr>
-        <w:t xml:space="preserve">  -  .gltf  (glTF, JSON form - textures and binary data are separate side files)</w:t>
-      </w:r>
-    </w:p>
-    <w:p>
-      <w:pPr>
+        <w:spacing w:before="0"/>
+        <w:ind w:left="540" w:hanging="630"/>
+        <w:jc w:val="both"/>
+        <w:rPr>
+          <w:lang w:val="en"/>
+        </w:rPr>
+      </w:pPr>
+      <w:r>
+        <w:rPr>
+          <w:lang w:val="en"/>
+        </w:rPr>
+        <w:t xml:space="preserve">  -  .</w:t>
+      </w:r>
+      <w:proofErr w:type="spellStart"/>
+      <w:r>
+        <w:rPr>
+          <w:lang w:val="en"/>
+        </w:rPr>
+        <w:t>gltf</w:t>
+      </w:r>
+      <w:proofErr w:type="spellEnd"/>
+      <w:r>
+        <w:rPr>
+          <w:lang w:val="en"/>
+        </w:rPr>
+        <w:t xml:space="preserve">  (</w:t>
+      </w:r>
+      <w:proofErr w:type="spellStart"/>
+      <w:r>
+        <w:rPr>
+          <w:lang w:val="en"/>
+        </w:rPr>
+        <w:t>glTF</w:t>
+      </w:r>
+      <w:proofErr w:type="spellEnd"/>
+      <w:r>
+        <w:rPr>
+          <w:lang w:val="en"/>
+        </w:rPr>
+        <w:t>, JSON form - textures and binary data are separate side files)</w:t>
+      </w:r>
+    </w:p>
+    <w:p>
+      <w:pPr>
+        <w:spacing w:before="0"/>
+        <w:ind w:left="540" w:hanging="630"/>
+        <w:jc w:val="both"/>
         <w:rPr>
           <w:lang w:val="en"/>
         </w:rPr>
@@ -123,6 +225,9 @@
     </w:p>
     <w:p>
       <w:pPr>
+        <w:spacing w:before="0" w:after="0"/>
+        <w:ind w:left="548" w:hanging="634"/>
+        <w:jc w:val="both"/>
         <w:rPr>
           <w:lang w:val="en"/>
         </w:rPr>
@@ -145,6 +250,7 @@
         <w:rPr>
           <w:lang w:val="en"/>
         </w:rPr>
+        <w:lastRenderedPageBreak/>
         <w:t>How to open it</w:t>
       </w:r>
     </w:p>
@@ -263,6 +369,53 @@
         <w:rPr>
           <w:lang w:val="en"/>
         </w:rPr>
+        <w:drawing>
+          <wp:inline distT="0" distB="0" distL="0" distR="0" wp14:anchorId="7326074E" wp14:editId="14F33386">
+            <wp:extent cx="2362530" cy="2638793"/>
+            <wp:effectExtent l="0" t="0" r="0" b="0"/>
+            <wp:docPr id="1536021692" name="Picture 1"/>
+            <wp:cNvGraphicFramePr>
+              <a:graphicFrameLocks xmlns:a="http://schemas.openxmlformats.org/drawingml/2006/main" noChangeAspect="1"/>
+            </wp:cNvGraphicFramePr>
+            <a:graphic xmlns:a="http://schemas.openxmlformats.org/drawingml/2006/main">
+              <a:graphicData uri="http://schemas.openxmlformats.org/drawingml/2006/picture">
+                <pic:pic xmlns:pic="http://schemas.openxmlformats.org/drawingml/2006/picture">
+                  <pic:nvPicPr>
+                    <pic:cNvPr id="1536021692" name=""/>
+                    <pic:cNvPicPr/>
+                  </pic:nvPicPr>
+                  <pic:blipFill>
+                    <a:blip r:embed="rId5"/>
+                    <a:stretch>
+                      <a:fillRect/>
+                    </a:stretch>
+                  </pic:blipFill>
+                  <pic:spPr>
+                    <a:xfrm>
+                      <a:off x="0" y="0"/>
+                      <a:ext cx="2362530" cy="2638793"/>
+                    </a:xfrm>
+                    <a:prstGeom prst="rect">
+                      <a:avLst/>
+                    </a:prstGeom>
+                  </pic:spPr>
+                </pic:pic>
+              </a:graphicData>
+            </a:graphic>
+          </wp:inline>
+        </w:drawing>
+      </w:r>
+    </w:p>
+    <w:p>
+      <w:pPr>
+        <w:rPr>
+          <w:lang w:val="en"/>
+        </w:rPr>
+      </w:pPr>
+      <w:r>
+        <w:rPr>
+          <w:lang w:val="en"/>
+        </w:rPr>
         <w:t xml:space="preserve">    For a closer look, click "Preview..." to open the file in the separate, full GltfViewer tool window - a more complete standalone viewer, useful for a closer look at any format.</w:t>
       </w:r>
     </w:p>
@@ -289,19 +442,34 @@
         <w:rPr>
           <w:lang w:val="en"/>
         </w:rPr>
-        <w:t xml:space="preserve">    If a model looks too small or too big to see properly in the preview, do not worry - that is a limit of the preview camera, not your model. See "Scale" and "Fixing a preview that will not zoom out far enough" below.</w:t>
-      </w:r>
-    </w:p>
-    <w:p>
-      <w:pPr>
-        <w:rPr>
-          <w:lang w:val="en"/>
-        </w:rPr>
-      </w:pPr>
-      <w:r>
-        <w:rPr>
-          <w:lang w:val="en"/>
-        </w:rPr>
+        <w:t xml:space="preserve">    If a model looks too small or too big to see properly in the preview, do not worry - that is </w:t>
+      </w:r>
+      <w:proofErr w:type="gramStart"/>
+      <w:r>
+        <w:rPr>
+          <w:lang w:val="en"/>
+        </w:rPr>
+        <w:t>a limit</w:t>
+      </w:r>
+      <w:proofErr w:type="gramEnd"/>
+      <w:r>
+        <w:rPr>
+          <w:lang w:val="en"/>
+        </w:rPr>
+        <w:t xml:space="preserve"> of the preview camera, not your model. See "Scale" and "Fixing a preview that will not zoom out far enough" below.</w:t>
+      </w:r>
+    </w:p>
+    <w:p>
+      <w:pPr>
+        <w:rPr>
+          <w:lang w:val="en"/>
+        </w:rPr>
+      </w:pPr>
+      <w:r>
+        <w:rPr>
+          <w:lang w:val="en"/>
+        </w:rPr>
+        <w:lastRenderedPageBreak/>
         <w:t>4.  SET THE SCALE (OPTIONAL)</w:t>
       </w:r>
     </w:p>
@@ -315,7 +483,66 @@
         <w:rPr>
           <w:lang w:val="en"/>
         </w:rPr>
-        <w:t xml:space="preserve">    The "Scale" box multiplies the model’s real-world size before it is built into the OAR. It defaults to 1, which means the model is loaded at its real size with no change. Type 2 to load it twice as big, or 0.5 to load it at half size. DreamGrid remembers the last Scale you used the next time you open the Mesh Uploader.</w:t>
+        <w:t xml:space="preserve">    The "Scale" box multiplies the model’s real-world size before it is built into the OAR. It defaults to 1, which means the model is loaded at its real size with no change. Type 2 to load it twice as big, or 0.5 to load it at half size. DreamGrid remembers the last Scale you used the next time you </w:t>
+      </w:r>
+      <w:r>
+        <w:rPr>
+          <w:lang w:val="en"/>
+        </w:rPr>
+        <w:t>opened</w:t>
+      </w:r>
+      <w:r>
+        <w:rPr>
+          <w:lang w:val="en"/>
+        </w:rPr>
+        <w:t xml:space="preserve"> the Mesh Uploader.</w:t>
+      </w:r>
+    </w:p>
+    <w:p>
+      <w:pPr>
+        <w:rPr>
+          <w:lang w:val="en"/>
+        </w:rPr>
+      </w:pPr>
+      <w:r>
+        <w:rPr>
+          <w:lang w:val="en"/>
+        </w:rPr>
+        <w:drawing>
+          <wp:inline distT="0" distB="0" distL="0" distR="0" wp14:anchorId="5414A125" wp14:editId="3676D8C4">
+            <wp:extent cx="2429214" cy="695422"/>
+            <wp:effectExtent l="0" t="0" r="9525" b="9525"/>
+            <wp:docPr id="37460524" name="Picture 1"/>
+            <wp:cNvGraphicFramePr>
+              <a:graphicFrameLocks xmlns:a="http://schemas.openxmlformats.org/drawingml/2006/main" noChangeAspect="1"/>
+            </wp:cNvGraphicFramePr>
+            <a:graphic xmlns:a="http://schemas.openxmlformats.org/drawingml/2006/main">
+              <a:graphicData uri="http://schemas.openxmlformats.org/drawingml/2006/picture">
+                <pic:pic xmlns:pic="http://schemas.openxmlformats.org/drawingml/2006/picture">
+                  <pic:nvPicPr>
+                    <pic:cNvPr id="37460524" name=""/>
+                    <pic:cNvPicPr/>
+                  </pic:nvPicPr>
+                  <pic:blipFill>
+                    <a:blip r:embed="rId6"/>
+                    <a:stretch>
+                      <a:fillRect/>
+                    </a:stretch>
+                  </pic:blipFill>
+                  <pic:spPr>
+                    <a:xfrm>
+                      <a:off x="0" y="0"/>
+                      <a:ext cx="2429214" cy="695422"/>
+                    </a:xfrm>
+                    <a:prstGeom prst="rect">
+                      <a:avLst/>
+                    </a:prstGeom>
+                  </pic:spPr>
+                </pic:pic>
+              </a:graphicData>
+            </a:graphic>
+          </wp:inline>
+        </w:drawing>
       </w:r>
     </w:p>
     <w:p>
@@ -359,6 +586,53 @@
     </w:p>
     <w:p>
       <w:pPr>
+        <w:rPr>
+          <w:lang w:val="en"/>
+        </w:rPr>
+      </w:pPr>
+      <w:r>
+        <w:rPr>
+          <w:lang w:val="en"/>
+        </w:rPr>
+        <w:drawing>
+          <wp:inline distT="0" distB="0" distL="0" distR="0" wp14:anchorId="2908028F" wp14:editId="3D386798">
+            <wp:extent cx="4810796" cy="943107"/>
+            <wp:effectExtent l="0" t="0" r="0" b="9525"/>
+            <wp:docPr id="1456574829" name="Picture 1"/>
+            <wp:cNvGraphicFramePr>
+              <a:graphicFrameLocks xmlns:a="http://schemas.openxmlformats.org/drawingml/2006/main" noChangeAspect="1"/>
+            </wp:cNvGraphicFramePr>
+            <a:graphic xmlns:a="http://schemas.openxmlformats.org/drawingml/2006/main">
+              <a:graphicData uri="http://schemas.openxmlformats.org/drawingml/2006/picture">
+                <pic:pic xmlns:pic="http://schemas.openxmlformats.org/drawingml/2006/picture">
+                  <pic:nvPicPr>
+                    <pic:cNvPr id="1456574829" name=""/>
+                    <pic:cNvPicPr/>
+                  </pic:nvPicPr>
+                  <pic:blipFill>
+                    <a:blip r:embed="rId7"/>
+                    <a:stretch>
+                      <a:fillRect/>
+                    </a:stretch>
+                  </pic:blipFill>
+                  <pic:spPr>
+                    <a:xfrm>
+                      <a:off x="0" y="0"/>
+                      <a:ext cx="4810796" cy="943107"/>
+                    </a:xfrm>
+                    <a:prstGeom prst="rect">
+                      <a:avLst/>
+                    </a:prstGeom>
+                  </pic:spPr>
+                </pic:pic>
+              </a:graphicData>
+            </a:graphic>
+          </wp:inline>
+        </w:drawing>
+      </w:r>
+    </w:p>
+    <w:p>
+      <w:pPr>
         <w:pStyle w:val="Heading3"/>
         <w:rPr>
           <w:lang w:val="en"/>
@@ -394,7 +668,21 @@
         <w:rPr>
           <w:lang w:val="en"/>
         </w:rPr>
-        <w:t xml:space="preserve">      -  Type the X, Y, and Z coordinates where you want the model to land. This defaults to roughly the region’s center, 128, 128, 30.</w:t>
+        <w:t xml:space="preserve">      -  Type </w:t>
+      </w:r>
+      <w:proofErr w:type="gramStart"/>
+      <w:r>
+        <w:rPr>
+          <w:lang w:val="en"/>
+        </w:rPr>
+        <w:t>the X</w:t>
+      </w:r>
+      <w:proofErr w:type="gramEnd"/>
+      <w:r>
+        <w:rPr>
+          <w:lang w:val="en"/>
+        </w:rPr>
+        <w:t>, Y, and Z coordinates where you want the model to land. This defaults to roughly the region’s center, 128, 128, 30.</w:t>
       </w:r>
     </w:p>
     <w:p>
@@ -447,19 +735,48 @@
         <w:rPr>
           <w:lang w:val="en"/>
         </w:rPr>
-        <w:t xml:space="preserve">      -  As soon as you tab or click away from the field, DreamGrid searches every booted region for that avatar. If found, it automatically fills in the Target Region and X/Y/Z fields for you - positioned about 2 meters in front of the avatar, in the direction they are looking, at roughly chest height. This lets you place an object right where someone is looking without typing exact coordinates yourself.</w:t>
-      </w:r>
-    </w:p>
-    <w:p>
-      <w:pPr>
-        <w:rPr>
-          <w:lang w:val="en"/>
-        </w:rPr>
-      </w:pPr>
-      <w:r>
-        <w:rPr>
-          <w:lang w:val="en"/>
-        </w:rPr>
+        <w:t xml:space="preserve">      -  As soon as you tab or click away from the field, DreamGrid searches every booted region for that avatar. If found, it automatically fills in the Target Region and X/Y/Z fields for you - positioned about 2 meters in front of the avatar, in the direction they </w:t>
+      </w:r>
+      <w:proofErr w:type="gramStart"/>
+      <w:r>
+        <w:rPr>
+          <w:lang w:val="en"/>
+        </w:rPr>
+        <w:t>are looking,</w:t>
+      </w:r>
+      <w:proofErr w:type="gramEnd"/>
+      <w:r>
+        <w:rPr>
+          <w:lang w:val="en"/>
+        </w:rPr>
+        <w:t xml:space="preserve"> at roughly chest height. This lets you place an object right where someone is looking without typing </w:t>
+      </w:r>
+      <w:proofErr w:type="gramStart"/>
+      <w:r>
+        <w:rPr>
+          <w:lang w:val="en"/>
+        </w:rPr>
+        <w:t>exact</w:t>
+      </w:r>
+      <w:proofErr w:type="gramEnd"/>
+      <w:r>
+        <w:rPr>
+          <w:lang w:val="en"/>
+        </w:rPr>
+        <w:t xml:space="preserve"> coordinates yourself.</w:t>
+      </w:r>
+    </w:p>
+    <w:p>
+      <w:pPr>
+        <w:rPr>
+          <w:lang w:val="en"/>
+        </w:rPr>
+      </w:pPr>
+      <w:r>
+        <w:rPr>
+          <w:lang w:val="en"/>
+        </w:rPr>
+        <w:lastRenderedPageBreak/>
         <w:t xml:space="preserve">      -  If the avatar is not found online in any booted region, you will get a message saying so, and the uploader falls back to whatever region and X/Y/Z is already typed in those fields.</w:t>
       </w:r>
     </w:p>
@@ -506,7 +823,21 @@
         <w:rPr>
           <w:lang w:val="en"/>
         </w:rPr>
-        <w:t xml:space="preserve">      a.  Builds a native </w:t>
+        <w:t xml:space="preserve">      a.  </w:t>
+      </w:r>
+      <w:proofErr w:type="gramStart"/>
+      <w:r>
+        <w:rPr>
+          <w:lang w:val="en"/>
+        </w:rPr>
+        <w:t>Builds</w:t>
+      </w:r>
+      <w:proofErr w:type="gramEnd"/>
+      <w:r>
+        <w:rPr>
+          <w:lang w:val="en"/>
+        </w:rPr>
+        <w:t xml:space="preserve"> a native </w:t>
       </w:r>
       <w:r>
         <w:rPr>
@@ -569,7 +900,21 @@
         <w:rPr>
           <w:lang w:val="en"/>
         </w:rPr>
-        <w:t xml:space="preserve">    Progress and any warnings or errors (vertex counts, triangle counts, material problems, and so on) stream live into the Status box at the bottom of the window while it runs. Watch this box - a vertex-limit failure or other build problem is reported there, naming the exact mesh part that caused it.</w:t>
+        <w:t xml:space="preserve">    Progress and any warnings or errors (vertex counts, triangle counts, material problems, and so on) stream live into the Status box at the bottom of the window while it runs. Watch this box - a vertex-limit failure or other </w:t>
+      </w:r>
+      <w:proofErr w:type="gramStart"/>
+      <w:r>
+        <w:rPr>
+          <w:lang w:val="en"/>
+        </w:rPr>
+        <w:t>build</w:t>
+      </w:r>
+      <w:proofErr w:type="gramEnd"/>
+      <w:r>
+        <w:rPr>
+          <w:lang w:val="en"/>
+        </w:rPr>
+        <w:t xml:space="preserve"> problem is reported there, naming the exact mesh part that caused it.</w:t>
       </w:r>
     </w:p>
     <w:p>
@@ -596,7 +941,20 @@
         <w:rPr>
           <w:lang w:val="en"/>
         </w:rPr>
-        <w:t xml:space="preserve">Physics - how avatars bump into it</w:t>
+        <w:t>Physics - how avatars bump into it</w:t>
+      </w:r>
+    </w:p>
+    <w:p>
+      <w:pPr>
+        <w:rPr>
+          <w:lang w:val="en"/>
+        </w:rPr>
+      </w:pPr>
+      <w:r>
+        <w:rPr>
+          <w:lang w:val="en"/>
+        </w:rPr>
+        <w:t>The “Physics” list, next to “Loop animation”, decides what solid shape OpenSim uses when an avatar walks into the object or something falls on it. It does not change how the object looks - only what you bump into.</w:t>
       </w:r>
     </w:p>
     <w:p>
@@ -609,89 +967,125 @@
       </w:pPr>
       <w:r>
         <w:rPr>
-          <w:lang w:val="en"/>
-        </w:rPr>
-        <w:t xml:space="preserve">The “Physics” list, next to “Loop animation”, decides what solid shape OpenSim uses when an avatar walks into the object or something falls on it. It does not change how the object looks - only what you bump into.</w:t>
-      </w:r>
-    </w:p>
-    <w:p>
-      <w:pPr>
-        <w:rPr>
-          <w:lang w:val="en"/>
-        </w:rPr>
-      </w:pPr>
-      <w:r>
-        <w:rPr>
-          <w:lang w:val="en"/>
-        </w:rPr>
-        <w:t xml:space="preserve">  -  How it looks (the default) - the object is as solid as it looks. You can walk through its doorways and under its arches. This works with both physics engines, ubODE and Bullet.</w:t>
-      </w:r>
-    </w:p>
-    <w:p>
-      <w:pPr>
-        <w:rPr>
-          <w:lang w:val="en"/>
-        </w:rPr>
-      </w:pPr>
-      <w:r>
-        <w:rPr>
-          <w:lang w:val="en"/>
-        </w:rPr>
-        <w:t xml:space="preserve">  -  Convex hull - one tight skin wrapped around each part, like shrink-wrap. Doorways and hollows are filled in. It is lighter work for the physics engine, and good for rocks, furniture and vehicles.</w:t>
-      </w:r>
-    </w:p>
-    <w:p>
-      <w:pPr>
-        <w:rPr>
-          <w:lang w:val="en"/>
-        </w:rPr>
-      </w:pPr>
-      <w:r>
-        <w:rPr>
-          <w:lang w:val="en"/>
-        </w:rPr>
-        <w:t xml:space="preserve">  -  Box per part - a box around each part.</w:t>
-      </w:r>
-    </w:p>
-    <w:p>
-      <w:pPr>
-        <w:rPr>
-          <w:lang w:val="en"/>
-        </w:rPr>
-      </w:pPr>
-      <w:r>
-        <w:rPr>
-          <w:lang w:val="en"/>
-        </w:rPr>
-        <w:t xml:space="preserve">  -  One box - one box around the whole object. The other parts have no physics at all.</w:t>
-      </w:r>
-    </w:p>
-    <w:p>
-      <w:pPr>
-        <w:rPr>
-          <w:lang w:val="en"/>
-        </w:rPr>
-      </w:pPr>
-      <w:r>
-        <w:rPr>
-          <w:lang w:val="en"/>
-        </w:rPr>
-        <w:t xml:space="preserve">  -  Hexagon - like One box, but a six-sided column. Good for round things such as trees and towers.</w:t>
-      </w:r>
-    </w:p>
-    <w:p>
-      <w:pPr>
-        <w:rPr>
           <w:b/>
           <w:bCs/>
           <w:lang w:val="en"/>
         </w:rPr>
-      </w:pPr>
-      <w:r>
-        <w:rPr>
-          <w:lang w:val="en"/>
-        </w:rPr>
-        <w:t xml:space="preserve">Your choice is remembered for the next upload. The web upload page has the same list.</w:t>
+        <w:drawing>
+          <wp:inline distT="0" distB="0" distL="0" distR="0" wp14:anchorId="449C7880" wp14:editId="41C7AAC1">
+            <wp:extent cx="3238952" cy="1752845"/>
+            <wp:effectExtent l="0" t="0" r="0" b="0"/>
+            <wp:docPr id="1072074446" name="Picture 1"/>
+            <wp:cNvGraphicFramePr>
+              <a:graphicFrameLocks xmlns:a="http://schemas.openxmlformats.org/drawingml/2006/main" noChangeAspect="1"/>
+            </wp:cNvGraphicFramePr>
+            <a:graphic xmlns:a="http://schemas.openxmlformats.org/drawingml/2006/main">
+              <a:graphicData uri="http://schemas.openxmlformats.org/drawingml/2006/picture">
+                <pic:pic xmlns:pic="http://schemas.openxmlformats.org/drawingml/2006/picture">
+                  <pic:nvPicPr>
+                    <pic:cNvPr id="1072074446" name=""/>
+                    <pic:cNvPicPr/>
+                  </pic:nvPicPr>
+                  <pic:blipFill>
+                    <a:blip r:embed="rId8"/>
+                    <a:stretch>
+                      <a:fillRect/>
+                    </a:stretch>
+                  </pic:blipFill>
+                  <pic:spPr>
+                    <a:xfrm>
+                      <a:off x="0" y="0"/>
+                      <a:ext cx="3238952" cy="1752845"/>
+                    </a:xfrm>
+                    <a:prstGeom prst="rect">
+                      <a:avLst/>
+                    </a:prstGeom>
+                  </pic:spPr>
+                </pic:pic>
+              </a:graphicData>
+            </a:graphic>
+          </wp:inline>
+        </w:drawing>
+      </w:r>
+    </w:p>
+    <w:p>
+      <w:pPr>
+        <w:rPr>
+          <w:lang w:val="en"/>
+        </w:rPr>
+      </w:pPr>
+      <w:r>
+        <w:rPr>
+          <w:lang w:val="en"/>
+        </w:rPr>
+        <w:t xml:space="preserve">  -  How it looks (the default) - the object is as solid as it looks. You can walk through its doorways and under its arches. This works with both </w:t>
+      </w:r>
+      <w:proofErr w:type="gramStart"/>
+      <w:r>
+        <w:rPr>
+          <w:lang w:val="en"/>
+        </w:rPr>
+        <w:t>physics</w:t>
+      </w:r>
+      <w:proofErr w:type="gramEnd"/>
+      <w:r>
+        <w:rPr>
+          <w:lang w:val="en"/>
+        </w:rPr>
+        <w:t xml:space="preserve"> engines, ubODE and Bullet.</w:t>
+      </w:r>
+    </w:p>
+    <w:p>
+      <w:pPr>
+        <w:rPr>
+          <w:lang w:val="en"/>
+        </w:rPr>
+      </w:pPr>
+      <w:r>
+        <w:rPr>
+          <w:lang w:val="en"/>
+        </w:rPr>
+        <w:t xml:space="preserve">  -  Convex hull - one tight skin wrapped around each part, like shrink-wrap. Doorways and hollows are filled in. It is lighter work for the physics engine, and good for rocks, furniture and vehicles.</w:t>
+      </w:r>
+    </w:p>
+    <w:p>
+      <w:pPr>
+        <w:rPr>
+          <w:lang w:val="en"/>
+        </w:rPr>
+      </w:pPr>
+      <w:r>
+        <w:rPr>
+          <w:lang w:val="en"/>
+        </w:rPr>
+        <w:lastRenderedPageBreak/>
+        <w:t xml:space="preserve">  -  Box per part - a box around each part.</w:t>
+      </w:r>
+    </w:p>
+    <w:p>
+      <w:pPr>
+        <w:rPr>
+          <w:lang w:val="en"/>
+        </w:rPr>
+      </w:pPr>
+      <w:r>
+        <w:rPr>
+          <w:lang w:val="en"/>
+        </w:rPr>
+        <w:t xml:space="preserve">  -  One box - one box around the whole object. The other parts have no physics at all.</w:t>
+      </w:r>
+    </w:p>
+    <w:p>
+      <w:pPr>
+        <w:rPr>
+          <w:lang w:val="en"/>
+        </w:rPr>
+      </w:pPr>
+      <w:r>
+        <w:rPr>
+          <w:lang w:val="en"/>
+        </w:rPr>
+        <w:t xml:space="preserve">  -  Hexagon - like One box, but a six-sided column. Good for round things such as trees and towers.</w:t>
       </w:r>
     </w:p>
     <w:p>
@@ -706,7 +1100,7 @@
         <w:rPr>
           <w:lang w:val="en"/>
         </w:rPr>
-        <w:t xml:space="preserve">Clothing and avatars always get a convex hull, the same as an upload from the viewer. Physics does not matter for something you wear.</w:t>
+        <w:t>Your choice is remembered for the next upload. The web upload page has the same list.</w:t>
       </w:r>
     </w:p>
     <w:p>
@@ -719,46 +1113,73 @@
       </w:pPr>
       <w:r>
         <w:rPr>
+          <w:lang w:val="en"/>
+        </w:rPr>
+        <w:t>Clothing and avatars always get a convex hull, the same as an upload from the viewer. Physics does not matter for something you wear.</w:t>
+      </w:r>
+    </w:p>
+    <w:p>
+      <w:pPr>
+        <w:rPr>
           <w:b/>
           <w:bCs/>
           <w:lang w:val="en"/>
         </w:rPr>
-        <w:t xml:space="preserve">CAUTION:</w:t>
-      </w:r>
-      <w:r>
-        <w:rPr>
-          <w:lang w:val="en"/>
-        </w:rPr>
-        <w:t xml:space="preserve"> How it looks is the most work for the physics engine on a very detailed model. If a big, detailed object makes the region slow, upload it again with Convex hull or One box.</w:t>
-      </w:r>
-    </w:p>
-    <w:p>
-      <w:pPr>
-        <w:pStyle w:val="Heading2"/>
-        <w:rPr>
-          <w:lang w:val="en"/>
-        </w:rPr>
-      </w:pPr>
-      <w:r>
-        <w:rPr>
-          <w:lang w:val="en"/>
-        </w:rPr>
-        <w:t xml:space="preserve">Levels of detail - the “LOD...” button</w:t>
-      </w:r>
-    </w:p>
-    <w:p>
-      <w:pPr>
+      </w:pPr>
+      <w:r>
         <w:rPr>
           <w:b/>
           <w:bCs/>
           <w:lang w:val="en"/>
         </w:rPr>
-      </w:pPr>
-      <w:r>
-        <w:rPr>
-          <w:lang w:val="en"/>
-        </w:rPr>
-        <w:t xml:space="preserve">Viewers draw an object with less detail when it is far away, so a busy region stays fast. A mesh carries four versions of itself for this: High (the model as you made it), Medium, Low and Lowest. The Mesh Uploader makes Medium, Low and Lowest for you.</w:t>
+        <w:t>CAUTION:</w:t>
+      </w:r>
+      <w:r>
+        <w:rPr>
+          <w:lang w:val="en"/>
+        </w:rPr>
+        <w:t xml:space="preserve"> How it looks is the most work for the physics engine on a very detailed model. If a big, detailed object makes the region slow, upload it again with </w:t>
+      </w:r>
+      <w:proofErr w:type="gramStart"/>
+      <w:r>
+        <w:rPr>
+          <w:lang w:val="en"/>
+        </w:rPr>
+        <w:t>Convex</w:t>
+      </w:r>
+      <w:proofErr w:type="gramEnd"/>
+      <w:r>
+        <w:rPr>
+          <w:lang w:val="en"/>
+        </w:rPr>
+        <w:t xml:space="preserve"> hull or One box.</w:t>
+      </w:r>
+    </w:p>
+    <w:p>
+      <w:pPr>
+        <w:pStyle w:val="Heading2"/>
+        <w:rPr>
+          <w:lang w:val="en"/>
+        </w:rPr>
+      </w:pPr>
+      <w:r>
+        <w:rPr>
+          <w:lang w:val="en"/>
+        </w:rPr>
+        <w:t>Levels of detail - the “LOD...” button</w:t>
+      </w:r>
+    </w:p>
+    <w:p>
+      <w:pPr>
+        <w:rPr>
+          <w:lang w:val="en"/>
+        </w:rPr>
+      </w:pPr>
+      <w:r>
+        <w:rPr>
+          <w:lang w:val="en"/>
+        </w:rPr>
+        <w:t>Viewers draw an object with less detail when it is far away, so a busy region stays fast. A mesh carries four versions of itself for this: High (the model as you made it), Medium, Low and Lowest. The Mesh Uploader makes Medium, Low and Lowest for you.</w:t>
       </w:r>
     </w:p>
     <w:p>
@@ -771,76 +1192,45 @@
       </w:pPr>
       <w:r>
         <w:rPr>
-          <w:lang w:val="en"/>
-        </w:rPr>
-        <w:t xml:space="preserve">Click “LOD...”, next to “Preview...”, to change how they are made. Each of the three levels has a choice:</w:t>
-      </w:r>
-    </w:p>
-    <w:p>
-      <w:pPr>
-        <w:rPr>
-          <w:lang w:val="en"/>
-        </w:rPr>
-      </w:pPr>
-      <w:r>
-        <w:rPr>
-          <w:lang w:val="en"/>
-        </w:rPr>
-        <w:t xml:space="preserve">  -  Generate Auto (the default) - DreamGrid makes a simpler copy of the High model, the same way the Firestorm viewer does when you upload there.</w:t>
-      </w:r>
-    </w:p>
-    <w:p>
-      <w:pPr>
-        <w:rPr>
-          <w:lang w:val="en"/>
-        </w:rPr>
-      </w:pPr>
-      <w:r>
-        <w:rPr>
-          <w:lang w:val="en"/>
-        </w:rPr>
-        <w:t xml:space="preserve">  -  Use LOD above - the level is a copy of the one above it. Use this if the automatic copy looks wrong from a distance.</w:t>
-      </w:r>
-    </w:p>
-    <w:p>
-      <w:pPr>
-        <w:rPr>
           <w:b/>
           <w:bCs/>
           <w:lang w:val="en"/>
         </w:rPr>
-      </w:pPr>
-      <w:r>
-        <w:rPr>
-          <w:lang w:val="en"/>
-        </w:rPr>
-        <w:t xml:space="preserve">With Generate Auto you can set how much detail to keep:</w:t>
-      </w:r>
-    </w:p>
-    <w:p>
-      <w:pPr>
-        <w:rPr>
-          <w:lang w:val="en"/>
-        </w:rPr>
-      </w:pPr>
-      <w:r>
-        <w:rPr>
-          <w:lang w:val="en"/>
-        </w:rPr>
-        <w:t xml:space="preserve">  -  Triangle limit - the most triangles the level may have. Leave it at 0 to use the viewer’s own default: the High model’s triangles divided by 3 for Medium, by 9 for Low and by 27 for Lowest.</w:t>
-      </w:r>
-    </w:p>
-    <w:p>
-      <w:pPr>
-        <w:rPr>
-          <w:lang w:val="en"/>
-        </w:rPr>
-      </w:pPr>
-      <w:r>
-        <w:rPr>
-          <w:lang w:val="en"/>
-        </w:rPr>
-        <w:t xml:space="preserve">  -  Error threshold % - how far the simpler copy may move away from the High model’s shape, as a percent of the model’s size. A small number keeps more detail.</w:t>
+        <w:drawing>
+          <wp:inline distT="0" distB="0" distL="0" distR="0" wp14:anchorId="54180541" wp14:editId="440653F0">
+            <wp:extent cx="4257675" cy="2870592"/>
+            <wp:effectExtent l="0" t="0" r="0" b="0"/>
+            <wp:docPr id="304800846" name="Picture 1"/>
+            <wp:cNvGraphicFramePr>
+              <a:graphicFrameLocks xmlns:a="http://schemas.openxmlformats.org/drawingml/2006/main" noChangeAspect="1"/>
+            </wp:cNvGraphicFramePr>
+            <a:graphic xmlns:a="http://schemas.openxmlformats.org/drawingml/2006/main">
+              <a:graphicData uri="http://schemas.openxmlformats.org/drawingml/2006/picture">
+                <pic:pic xmlns:pic="http://schemas.openxmlformats.org/drawingml/2006/picture">
+                  <pic:nvPicPr>
+                    <pic:cNvPr id="304800846" name=""/>
+                    <pic:cNvPicPr/>
+                  </pic:nvPicPr>
+                  <pic:blipFill>
+                    <a:blip r:embed="rId9"/>
+                    <a:stretch>
+                      <a:fillRect/>
+                    </a:stretch>
+                  </pic:blipFill>
+                  <pic:spPr>
+                    <a:xfrm>
+                      <a:off x="0" y="0"/>
+                      <a:ext cx="4262595" cy="2873909"/>
+                    </a:xfrm>
+                    <a:prstGeom prst="rect">
+                      <a:avLst/>
+                    </a:prstGeom>
+                  </pic:spPr>
+                </pic:pic>
+              </a:graphicData>
+            </a:graphic>
+          </wp:inline>
+        </w:drawing>
       </w:r>
     </w:p>
     <w:p>
@@ -855,73 +1245,33 @@
         <w:rPr>
           <w:lang w:val="en"/>
         </w:rPr>
-        <w:t xml:space="preserve">A level never gets more detail than the one above it; if it would, it becomes a copy of the level above. Your choices are remembered for the next upload. The web upload page has the same settings under “Advanced: levels of detail”.</w:t>
-      </w:r>
-    </w:p>
-    <w:p>
-      <w:pPr>
-        <w:pStyle w:val="Heading2"/>
-        <w:rPr>
-          <w:lang w:val="en"/>
-        </w:rPr>
-      </w:pPr>
-      <w:r>
-        <w:rPr>
-          <w:lang w:val="en"/>
-        </w:rPr>
-        <w:t>Wearable clothing and avatars (the "Clothing" and "Avatar" checkboxes)</w:t>
-      </w:r>
-    </w:p>
-    <w:p>
-      <w:pPr>
-        <w:rPr>
-          <w:lang w:val="en"/>
-        </w:rPr>
-      </w:pPr>
-      <w:r>
-        <w:rPr>
-          <w:lang w:val="en"/>
-        </w:rPr>
-        <w:t>AI mesh-generation tools such as Mixamo build rigged characters using their own bone names (things like "mixamorig_Hips", "mixamorig_LeftArm"), which Second Life and OpenSim’s own avatar skeleton does not recognize. Wearing a mesh like that as-is either fails outright or comes out badly deformed. The Mesh Uploader fixes this automatically for you, before it builds the OAR.</w:t>
-      </w:r>
-    </w:p>
-    <w:p>
-      <w:pPr>
-        <w:rPr>
-          <w:lang w:val="en"/>
-        </w:rPr>
-      </w:pPr>
-      <w:r>
-        <w:rPr>
-          <w:lang w:val="en"/>
-        </w:rPr>
-        <w:t>Two checkboxes appear under the source file picker:</w:t>
-      </w:r>
-    </w:p>
-    <w:p>
-      <w:pPr>
-        <w:rPr>
-          <w:lang w:val="en"/>
-        </w:rPr>
-      </w:pPr>
-      <w:r>
-        <w:rPr>
-          <w:lang w:val="en"/>
-        </w:rPr>
-        <w:t xml:space="preserve">  -  Clothing - for a rigged attachment: shoes, shirts, hair, and similar items that follow the shape of whatever body is wearing them. Converts a Mixamo rig to Second Life bone names and includes skin weights, so the item bends and moves correctly on any avatar body.</w:t>
-      </w:r>
-    </w:p>
-    <w:p>
-      <w:pPr>
-        <w:rPr>
-          <w:lang w:val="en"/>
-        </w:rPr>
-      </w:pPr>
-      <w:r>
-        <w:rPr>
-          <w:lang w:val="en"/>
-        </w:rPr>
-        <w:t xml:space="preserve">  -  Avatar - for a full custom avatar body or skeleton replacement. Does everything Clothing does, and also includes joint positions, which is what lets a custom body shape (not just standard proportions) come through correctly.</w:t>
+        <w:t>Click “LOD...”, next to “Preview...”, to change how they are made. Each of the three levels has a choice:</w:t>
+      </w:r>
+    </w:p>
+    <w:p>
+      <w:pPr>
+        <w:rPr>
+          <w:lang w:val="en"/>
+        </w:rPr>
+      </w:pPr>
+      <w:r>
+        <w:rPr>
+          <w:lang w:val="en"/>
+        </w:rPr>
+        <w:t xml:space="preserve">  -  Generate Auto (the default) - DreamGrid makes a simpler copy of the High model, the same way the Firestorm viewer does when you upload there.</w:t>
+      </w:r>
+    </w:p>
+    <w:p>
+      <w:pPr>
+        <w:rPr>
+          <w:lang w:val="en"/>
+        </w:rPr>
+      </w:pPr>
+      <w:r>
+        <w:rPr>
+          <w:lang w:val="en"/>
+        </w:rPr>
+        <w:t xml:space="preserve">  -  Use LOD above - the level is a copy of the one above it. Use this if the automatic copy looks wrong from a distance.</w:t>
       </w:r>
     </w:p>
     <w:p>
@@ -934,76 +1284,51 @@
       </w:pPr>
       <w:r>
         <w:rPr>
+          <w:lang w:val="en"/>
+        </w:rPr>
+        <w:lastRenderedPageBreak/>
+        <w:t>With Generate Auto you can set how much detail to keep:</w:t>
+      </w:r>
+    </w:p>
+    <w:p>
+      <w:pPr>
+        <w:rPr>
+          <w:lang w:val="en"/>
+        </w:rPr>
+      </w:pPr>
+      <w:r>
+        <w:rPr>
+          <w:lang w:val="en"/>
+        </w:rPr>
+        <w:t xml:space="preserve">  -  Triangle limit - the most triangles the level may have. Leave it at 0 to use the viewer’s own default: the High model’s triangles divided by 3 for Medium, by 9 for Low and by 27 for Lowest.</w:t>
+      </w:r>
+    </w:p>
+    <w:p>
+      <w:pPr>
+        <w:rPr>
+          <w:lang w:val="en"/>
+        </w:rPr>
+      </w:pPr>
+      <w:r>
+        <w:rPr>
+          <w:lang w:val="en"/>
+        </w:rPr>
+        <w:t xml:space="preserve">  -  Error threshold % - how far the simpler copy may move away from the High model’s shape, as a percent of the model’s size. A small number keeps more detail.</w:t>
+      </w:r>
+    </w:p>
+    <w:p>
+      <w:pPr>
+        <w:rPr>
           <w:b/>
           <w:bCs/>
           <w:lang w:val="en"/>
         </w:rPr>
-        <w:t>The object DreamGrid loads into the world is ready to wear.</w:t>
-      </w:r>
-    </w:p>
-    <w:p>
-      <w:pPr>
-        <w:rPr>
-          <w:lang w:val="en"/>
-        </w:rPr>
-      </w:pPr>
-      <w:r>
-        <w:rPr>
-          <w:lang w:val="en"/>
-        </w:rPr>
-        <w:t>With either box checked, the object that lands in your region is not just a preview - it already has its skin weights (and, for Avatar, its joint positions) and its textures built in. To wear it:</w:t>
-      </w:r>
-    </w:p>
-    <w:p>
-      <w:pPr>
-        <w:rPr>
-          <w:lang w:val="en"/>
-        </w:rPr>
-      </w:pPr>
-      <w:r>
-        <w:rPr>
-          <w:lang w:val="en"/>
-        </w:rPr>
-        <w:t xml:space="preserve">  1.  Right-click the object in-world and choose Take.</w:t>
-      </w:r>
-    </w:p>
-    <w:p>
-      <w:pPr>
-        <w:rPr>
-          <w:lang w:val="en"/>
-        </w:rPr>
-      </w:pPr>
-      <w:r>
-        <w:rPr>
-          <w:lang w:val="en"/>
-        </w:rPr>
-        <w:t xml:space="preserve">  2.  Find it in your inventory and Wear it.</w:t>
-      </w:r>
-    </w:p>
-    <w:p>
-      <w:pPr>
-        <w:rPr>
-          <w:lang w:val="en"/>
-        </w:rPr>
-      </w:pPr>
-      <w:r>
-        <w:rPr>
-          <w:lang w:val="en"/>
-        </w:rPr>
-        <w:t>That is the whole process - there is no separate step of re-uploading anything through a viewer.</w:t>
-      </w:r>
-    </w:p>
-    <w:p>
-      <w:pPr>
-        <w:rPr>
-          <w:lang w:val="en"/>
-        </w:rPr>
-      </w:pPr>
-      <w:r>
-        <w:rPr>
-          <w:lang w:val="en"/>
-        </w:rPr>
-        <w:t>If you would rather use your viewer’s own mesh uploader instead (for example, to double-check the result, or because you prefer that workflow), the Status box also prints the exact source file to use and which viewer-upload checkboxes to tick. Be aware that most viewers, including Firestorm, do not apply textures to a mesh uploaded as rigged clothing or an avatar - only DreamGrid’s own built-in object has the textures already on it.</w:t>
+      </w:pPr>
+      <w:r>
+        <w:rPr>
+          <w:lang w:val="en"/>
+        </w:rPr>
+        <w:t>A level never gets more detail than the one above it; if it would, it becomes a copy of the level above. Your choices are remembered for the next upload. The web upload page has the same settings under “Advanced: levels of detail”.</w:t>
       </w:r>
     </w:p>
     <w:p>
@@ -1017,191 +1342,562 @@
         <w:rPr>
           <w:lang w:val="en"/>
         </w:rPr>
-        <w:t>FBX files and armatures</w:t>
-      </w:r>
-    </w:p>
-    <w:p>
-      <w:pPr>
-        <w:rPr>
-          <w:lang w:val="en"/>
-        </w:rPr>
-      </w:pPr>
-      <w:r>
-        <w:rPr>
-          <w:lang w:val="en"/>
-        </w:rPr>
-        <w:t>An armature is the skeleton of bones inside a rigged model. It is what lets a worn mesh bend at the elbows and knees along with your avatar. FBX files from Mixamo, Tripo3D, and similar tools often carry one.</w:t>
-      </w:r>
-    </w:p>
-    <w:p>
-      <w:pPr>
-        <w:rPr>
-          <w:lang w:val="en"/>
-        </w:rPr>
-      </w:pPr>
-      <w:r>
-        <w:rPr>
-          <w:lang w:val="en"/>
-        </w:rPr>
-        <w:t>The Mesh Uploader reads an FBX file in one of two ways, depending on the Clothing and Avatar checkboxes:</w:t>
-      </w:r>
-    </w:p>
-    <w:p>
-      <w:pPr>
-        <w:rPr>
-          <w:lang w:val="en"/>
-        </w:rPr>
-      </w:pPr>
-      <w:r>
-        <w:rPr>
-          <w:lang w:val="en"/>
-        </w:rPr>
-        <w:t xml:space="preserve">  -  Both boxes unchecked: the armature is ignored. The model loads as an ordinary object, fixed in whatever pose it was saved in. Use this for props, furniture, statues, and buildings.</w:t>
-      </w:r>
-    </w:p>
-    <w:p>
-      <w:pPr>
-        <w:rPr>
-          <w:lang w:val="en"/>
-        </w:rPr>
-      </w:pPr>
-      <w:r>
-        <w:rPr>
-          <w:lang w:val="en"/>
-        </w:rPr>
-        <w:t xml:space="preserve">  -  Clothing or Avatar checked: the armature is kept. The model loads as a wearable, exactly as described in the section above.</w:t>
-      </w:r>
-    </w:p>
-    <w:p>
-      <w:pPr>
-        <w:rPr>
-          <w:lang w:val="en"/>
-        </w:rPr>
-      </w:pPr>
-      <w:r>
-        <w:rPr>
-          <w:lang w:val="en"/>
-        </w:rPr>
-        <w:t>For a wearable FBX, DreamGrid does some extra work for you behind the scenes:</w:t>
-      </w:r>
-    </w:p>
-    <w:p>
-      <w:pPr>
-        <w:rPr>
-          <w:lang w:val="en"/>
-        </w:rPr>
-      </w:pPr>
-      <w:r>
-        <w:rPr>
-          <w:lang w:val="en"/>
-        </w:rPr>
-        <w:t xml:space="preserve">  -  It saves a DAE copy of the model, with its textures, in a temporary folder on your computer. Your original FBX file is never changed.</w:t>
-      </w:r>
-    </w:p>
-    <w:p>
-      <w:pPr>
-        <w:rPr>
-          <w:lang w:val="en"/>
-        </w:rPr>
-      </w:pPr>
-      <w:r>
-        <w:rPr>
-          <w:lang w:val="en"/>
-        </w:rPr>
-        <w:t xml:space="preserve">  -  It converts that copy to Second Life bone names, the same way it does for a Mixamo .dae file.</w:t>
-      </w:r>
-    </w:p>
-    <w:p>
-      <w:pPr>
-        <w:rPr>
-          <w:lang w:val="en"/>
-        </w:rPr>
-      </w:pPr>
-      <w:r>
-        <w:rPr>
-          <w:lang w:val="en"/>
-        </w:rPr>
-        <w:t xml:space="preserve">  -  It turns the model to face the right way. Some tools save a model a quarter turn away from what OpenSim expects. You do not need to fix this yourself.</w:t>
-      </w:r>
-    </w:p>
-    <w:p>
-      <w:pPr>
-        <w:rPr>
-          <w:lang w:val="en"/>
-        </w:rPr>
-      </w:pPr>
-      <w:r>
-        <w:rPr>
-          <w:lang w:val="en"/>
-        </w:rPr>
-        <w:t xml:space="preserve">  -  It sizes the model to match the standard avatar skeleton.</w:t>
-      </w:r>
-    </w:p>
-    <w:p>
-      <w:pPr>
-        <w:rPr>
-          <w:lang w:val="en"/>
-        </w:rPr>
-      </w:pPr>
-      <w:r>
-        <w:rPr>
-          <w:lang w:val="en"/>
-        </w:rPr>
-        <w:t>The Status box reports these steps as they happen, including the full path of the DAE copy it made.</w:t>
-      </w:r>
-    </w:p>
-    <w:p>
-      <w:pPr>
-        <w:rPr>
-          <w:lang w:val="en"/>
-        </w:rPr>
-      </w:pPr>
-      <w:r>
-        <w:rPr>
-          <w:lang w:val="en"/>
-        </w:rPr>
-        <w:t>If you check Clothing or Avatar on an FBX file that has no armature, nothing breaks. The Status box tells you the file has no skeleton, and the model is built as an ordinary object instead.</w:t>
-      </w:r>
-    </w:p>
-    <w:p>
-      <w:pPr>
-        <w:rPr>
-          <w:lang w:val="en"/>
-        </w:rPr>
-      </w:pPr>
-      <w:r>
-        <w:rPr>
-          <w:lang w:val="en"/>
-        </w:rPr>
-        <w:t>Wearable FBX files need Python, just like wearable DAE files. See "Python requirement" below.</w:t>
-      </w:r>
-    </w:p>
-    <w:p>
-      <w:pPr>
-        <w:pStyle w:val="Heading3"/>
-        <w:rPr>
-          <w:lang w:val="en"/>
-        </w:rPr>
-      </w:pPr>
-      <w:r>
-        <w:rPr>
-          <w:lang w:val="en"/>
-        </w:rPr>
-        <w:t xml:space="preserve">  The model must be in a T-pose</w:t>
-      </w:r>
-    </w:p>
-    <w:p>
-      <w:pPr>
-        <w:rPr>
-          <w:lang w:val="en"/>
-        </w:rPr>
-      </w:pPr>
-      <w:r>
+        <w:t>Wearable clothing and avatars (the "Clothing" and "Avatar" checkboxes)</w:t>
+      </w:r>
+    </w:p>
+    <w:p>
+      <w:pPr>
+        <w:rPr>
+          <w:lang w:val="en"/>
+        </w:rPr>
+      </w:pPr>
+      <w:r>
+        <w:rPr>
+          <w:lang w:val="en"/>
+        </w:rPr>
+        <w:t>AI mesh-generation tools such as Mixamo build rigged characters using their own bone names (things like "mixamorig_Hips", "mixamorig_LeftArm"), which Second Life and OpenSim’s own avatar skeleton does not recognize. Wearing a mesh like that as-is either fails outright or comes out badly deformed. The Mesh Uploader fixes this automatically for you, before it builds the OAR.</w:t>
+      </w:r>
+    </w:p>
+    <w:p>
+      <w:pPr>
+        <w:rPr>
+          <w:lang w:val="en"/>
+        </w:rPr>
+      </w:pPr>
+      <w:r>
+        <w:rPr>
+          <w:lang w:val="en"/>
+        </w:rPr>
+        <w:t>Two checkboxes appear under the source file picker:</w:t>
+      </w:r>
+    </w:p>
+    <w:p>
+      <w:pPr>
+        <w:rPr>
+          <w:lang w:val="en"/>
+        </w:rPr>
+      </w:pPr>
+      <w:r>
+        <w:rPr>
+          <w:lang w:val="en"/>
+        </w:rPr>
+        <w:t xml:space="preserve">  -  Clothing - for a rigged attachment: shoes, shirts, hair, and similar items that follow the shape of whatever body is wearing them. Converts a Mixamo rig to Second Life bone names and includes skin weights, so the item bends and moves correctly on any avatar body.</w:t>
+      </w:r>
+    </w:p>
+    <w:p>
+      <w:pPr>
+        <w:rPr>
+          <w:lang w:val="en"/>
+        </w:rPr>
+      </w:pPr>
+      <w:r>
+        <w:rPr>
+          <w:lang w:val="en"/>
+        </w:rPr>
+        <w:t xml:space="preserve">  -  Avatar - for a full custom avatar body or skeleton replacement. Does everything Clothing does, </w:t>
+      </w:r>
+      <w:proofErr w:type="gramStart"/>
+      <w:r>
+        <w:rPr>
+          <w:lang w:val="en"/>
+        </w:rPr>
+        <w:t>and also</w:t>
+      </w:r>
+      <w:proofErr w:type="gramEnd"/>
+      <w:r>
+        <w:rPr>
+          <w:lang w:val="en"/>
+        </w:rPr>
+        <w:t xml:space="preserve"> includes joint positions, which is what lets a custom body shape (not just standard proportions) come through correctly.</w:t>
+      </w:r>
+    </w:p>
+    <w:p>
+      <w:pPr>
         <w:rPr>
           <w:b/>
           <w:bCs/>
           <w:lang w:val="en"/>
         </w:rPr>
+      </w:pPr>
+      <w:r>
+        <w:rPr>
+          <w:b/>
+          <w:bCs/>
+          <w:lang w:val="en"/>
+        </w:rPr>
+        <w:t>The object DreamGrid loads into the world is ready to wear.</w:t>
+      </w:r>
+    </w:p>
+    <w:p>
+      <w:pPr>
+        <w:rPr>
+          <w:lang w:val="en"/>
+        </w:rPr>
+      </w:pPr>
+      <w:r>
+        <w:rPr>
+          <w:lang w:val="en"/>
+        </w:rPr>
+        <w:t xml:space="preserve">With either box </w:t>
+      </w:r>
+      <w:proofErr w:type="gramStart"/>
+      <w:r>
+        <w:rPr>
+          <w:lang w:val="en"/>
+        </w:rPr>
+        <w:t>checked,</w:t>
+      </w:r>
+      <w:proofErr w:type="gramEnd"/>
+      <w:r>
+        <w:rPr>
+          <w:lang w:val="en"/>
+        </w:rPr>
+        <w:t xml:space="preserve"> the object that lands in your region is not just a preview - it already has its skin weights (and, for Avatar, its joint positions) and its textures built in. To wear it:</w:t>
+      </w:r>
+    </w:p>
+    <w:p>
+      <w:pPr>
+        <w:rPr>
+          <w:lang w:val="en"/>
+        </w:rPr>
+      </w:pPr>
+      <w:r>
+        <w:rPr>
+          <w:lang w:val="en"/>
+        </w:rPr>
+        <w:t xml:space="preserve">  1.  Right-click the object in-world and choose Take.</w:t>
+      </w:r>
+    </w:p>
+    <w:p>
+      <w:pPr>
+        <w:rPr>
+          <w:lang w:val="en"/>
+        </w:rPr>
+      </w:pPr>
+      <w:r>
+        <w:rPr>
+          <w:lang w:val="en"/>
+        </w:rPr>
+        <w:t xml:space="preserve">  2.  Find it in your inventory and </w:t>
+      </w:r>
+      <w:proofErr w:type="gramStart"/>
+      <w:r>
+        <w:rPr>
+          <w:lang w:val="en"/>
+        </w:rPr>
+        <w:t>Wear</w:t>
+      </w:r>
+      <w:proofErr w:type="gramEnd"/>
+      <w:r>
+        <w:rPr>
+          <w:lang w:val="en"/>
+        </w:rPr>
+        <w:t xml:space="preserve"> it.</w:t>
+      </w:r>
+    </w:p>
+    <w:p>
+      <w:pPr>
+        <w:rPr>
+          <w:lang w:val="en"/>
+        </w:rPr>
+      </w:pPr>
+      <w:r>
+        <w:rPr>
+          <w:lang w:val="en"/>
+        </w:rPr>
+        <w:t>That is the whole process - there is no separate step of re-uploading anything through a viewer.</w:t>
+      </w:r>
+    </w:p>
+    <w:p>
+      <w:pPr>
+        <w:rPr>
+          <w:lang w:val="en"/>
+        </w:rPr>
+      </w:pPr>
+      <w:r>
+        <w:rPr>
+          <w:lang w:val="en"/>
+        </w:rPr>
+        <w:t>If you would rather use your viewer’s own mesh uploader instead (for example, to double-check the result, or because you prefer that workflow), the Status box also prints the exact source file to use and which viewer-upload checkboxes to tick. Be aware that most viewers, including Firestorm, do not apply textures to a mesh uploaded as rigged clothing or an avatar - only DreamGrid’s own built-in object has the textures already on it.</w:t>
+      </w:r>
+    </w:p>
+    <w:p>
+      <w:pPr>
+        <w:pStyle w:val="Heading2"/>
+        <w:rPr>
+          <w:lang w:val="en"/>
+        </w:rPr>
+      </w:pPr>
+      <w:r>
+        <w:rPr>
+          <w:lang w:val="en"/>
+        </w:rPr>
+        <w:lastRenderedPageBreak/>
+        <w:t>FBX files and armatures</w:t>
+      </w:r>
+    </w:p>
+    <w:p>
+      <w:pPr>
+        <w:rPr>
+          <w:lang w:val="en"/>
+        </w:rPr>
+      </w:pPr>
+      <w:r>
+        <w:rPr>
+          <w:lang w:val="en"/>
+        </w:rPr>
+        <w:t>An armature is the skeleton of bones inside a rigged model. It is what lets a worn mesh bend at the elbows and knees along with your avatar. FBX files from Mixamo, Tripo3D, and similar tools often carry one.</w:t>
+      </w:r>
+    </w:p>
+    <w:p>
+      <w:pPr>
+        <w:rPr>
+          <w:lang w:val="en"/>
+        </w:rPr>
+      </w:pPr>
+      <w:r>
+        <w:rPr>
+          <w:lang w:val="en"/>
+        </w:rPr>
+        <w:drawing>
+          <wp:inline distT="0" distB="0" distL="0" distR="0" wp14:anchorId="4AABE53C" wp14:editId="05EAF924">
+            <wp:extent cx="1935956" cy="1798177"/>
+            <wp:effectExtent l="0" t="0" r="0" b="0"/>
+            <wp:docPr id="1433187577" name="Picture 1"/>
+            <wp:cNvGraphicFramePr>
+              <a:graphicFrameLocks xmlns:a="http://schemas.openxmlformats.org/drawingml/2006/main" noChangeAspect="1"/>
+            </wp:cNvGraphicFramePr>
+            <a:graphic xmlns:a="http://schemas.openxmlformats.org/drawingml/2006/main">
+              <a:graphicData uri="http://schemas.openxmlformats.org/drawingml/2006/picture">
+                <pic:pic xmlns:pic="http://schemas.openxmlformats.org/drawingml/2006/picture">
+                  <pic:nvPicPr>
+                    <pic:cNvPr id="1433187577" name=""/>
+                    <pic:cNvPicPr/>
+                  </pic:nvPicPr>
+                  <pic:blipFill>
+                    <a:blip r:embed="rId10"/>
+                    <a:stretch>
+                      <a:fillRect/>
+                    </a:stretch>
+                  </pic:blipFill>
+                  <pic:spPr>
+                    <a:xfrm>
+                      <a:off x="0" y="0"/>
+                      <a:ext cx="1942398" cy="1804161"/>
+                    </a:xfrm>
+                    <a:prstGeom prst="rect">
+                      <a:avLst/>
+                    </a:prstGeom>
+                  </pic:spPr>
+                </pic:pic>
+              </a:graphicData>
+            </a:graphic>
+          </wp:inline>
+        </w:drawing>
+      </w:r>
+      <w:r>
+        <w:rPr>
+          <w:noProof/>
+        </w:rPr>
+        <w:t xml:space="preserve"> </w:t>
+      </w:r>
+      <w:r>
+        <w:rPr>
+          <w:lang w:val="en"/>
+        </w:rPr>
+        <w:drawing>
+          <wp:inline distT="0" distB="0" distL="0" distR="0" wp14:anchorId="5F7FE9C9" wp14:editId="3C646B7B">
+            <wp:extent cx="1814513" cy="1796259"/>
+            <wp:effectExtent l="0" t="0" r="0" b="0"/>
+            <wp:docPr id="493698057" name="Picture 1"/>
+            <wp:cNvGraphicFramePr>
+              <a:graphicFrameLocks xmlns:a="http://schemas.openxmlformats.org/drawingml/2006/main" noChangeAspect="1"/>
+            </wp:cNvGraphicFramePr>
+            <a:graphic xmlns:a="http://schemas.openxmlformats.org/drawingml/2006/main">
+              <a:graphicData uri="http://schemas.openxmlformats.org/drawingml/2006/picture">
+                <pic:pic xmlns:pic="http://schemas.openxmlformats.org/drawingml/2006/picture">
+                  <pic:nvPicPr>
+                    <pic:cNvPr id="493698057" name=""/>
+                    <pic:cNvPicPr/>
+                  </pic:nvPicPr>
+                  <pic:blipFill>
+                    <a:blip r:embed="rId11"/>
+                    <a:stretch>
+                      <a:fillRect/>
+                    </a:stretch>
+                  </pic:blipFill>
+                  <pic:spPr>
+                    <a:xfrm rot="10800000" flipV="1">
+                      <a:off x="0" y="0"/>
+                      <a:ext cx="1842173" cy="1823640"/>
+                    </a:xfrm>
+                    <a:prstGeom prst="rect">
+                      <a:avLst/>
+                    </a:prstGeom>
+                  </pic:spPr>
+                </pic:pic>
+              </a:graphicData>
+            </a:graphic>
+          </wp:inline>
+        </w:drawing>
+      </w:r>
+      <w:r>
+        <w:rPr>
+          <w:noProof/>
+        </w:rPr>
+        <w:t xml:space="preserve"> </w:t>
+      </w:r>
+      <w:r>
+        <w:rPr>
+          <w:noProof/>
+        </w:rPr>
+        <w:drawing>
+          <wp:inline distT="0" distB="0" distL="0" distR="0" wp14:anchorId="67269E31" wp14:editId="1E330320">
+            <wp:extent cx="1743794" cy="1794975"/>
+            <wp:effectExtent l="0" t="0" r="0" b="0"/>
+            <wp:docPr id="1593605007" name="Picture 1"/>
+            <wp:cNvGraphicFramePr>
+              <a:graphicFrameLocks xmlns:a="http://schemas.openxmlformats.org/drawingml/2006/main" noChangeAspect="1"/>
+            </wp:cNvGraphicFramePr>
+            <a:graphic xmlns:a="http://schemas.openxmlformats.org/drawingml/2006/main">
+              <a:graphicData uri="http://schemas.openxmlformats.org/drawingml/2006/picture">
+                <pic:pic xmlns:pic="http://schemas.openxmlformats.org/drawingml/2006/picture">
+                  <pic:nvPicPr>
+                    <pic:cNvPr id="1593605007" name=""/>
+                    <pic:cNvPicPr/>
+                  </pic:nvPicPr>
+                  <pic:blipFill>
+                    <a:blip r:embed="rId12"/>
+                    <a:stretch>
+                      <a:fillRect/>
+                    </a:stretch>
+                  </pic:blipFill>
+                  <pic:spPr>
+                    <a:xfrm>
+                      <a:off x="0" y="0"/>
+                      <a:ext cx="1760558" cy="1812231"/>
+                    </a:xfrm>
+                    <a:prstGeom prst="rect">
+                      <a:avLst/>
+                    </a:prstGeom>
+                  </pic:spPr>
+                </pic:pic>
+              </a:graphicData>
+            </a:graphic>
+          </wp:inline>
+        </w:drawing>
+      </w:r>
+    </w:p>
+    <w:p>
+      <w:pPr>
+        <w:rPr>
+          <w:lang w:val="en"/>
+        </w:rPr>
+      </w:pPr>
+      <w:r>
+        <w:rPr>
+          <w:lang w:val="en"/>
+        </w:rPr>
+        <w:t xml:space="preserve">The Mesh Uploader reads an FBX file in one </w:t>
+      </w:r>
+      <w:proofErr w:type="gramStart"/>
+      <w:r>
+        <w:rPr>
+          <w:lang w:val="en"/>
+        </w:rPr>
+        <w:t>of</w:t>
+      </w:r>
+      <w:proofErr w:type="gramEnd"/>
+      <w:r>
+        <w:rPr>
+          <w:lang w:val="en"/>
+        </w:rPr>
+        <w:t xml:space="preserve"> two ways, depending on the Clothing and Avatar checkboxes:</w:t>
+      </w:r>
+    </w:p>
+    <w:p>
+      <w:pPr>
+        <w:rPr>
+          <w:lang w:val="en"/>
+        </w:rPr>
+      </w:pPr>
+      <w:r>
+        <w:rPr>
+          <w:lang w:val="en"/>
+        </w:rPr>
+        <w:t xml:space="preserve">  -  Both boxes unchecked: the armature is ignored. The model loads as an ordinary object, fixed in whatever pose it was saved in. Use this for props, furniture, statues, and buildings.</w:t>
+      </w:r>
+    </w:p>
+    <w:p>
+      <w:pPr>
+        <w:rPr>
+          <w:lang w:val="en"/>
+        </w:rPr>
+      </w:pPr>
+      <w:r>
+        <w:rPr>
+          <w:lang w:val="en"/>
+        </w:rPr>
+        <w:t xml:space="preserve">  -  Clothing or Avatar checked: the armature is kept. The model loads as a wearable, exactly as described in the section above.</w:t>
+      </w:r>
+    </w:p>
+    <w:p>
+      <w:pPr>
+        <w:rPr>
+          <w:lang w:val="en"/>
+        </w:rPr>
+      </w:pPr>
+      <w:r>
+        <w:rPr>
+          <w:lang w:val="en"/>
+        </w:rPr>
+        <w:t>For a wearable FBX, DreamGrid does some extra work for you behind the scenes:</w:t>
+      </w:r>
+    </w:p>
+    <w:p>
+      <w:pPr>
+        <w:rPr>
+          <w:lang w:val="en"/>
+        </w:rPr>
+      </w:pPr>
+      <w:r>
+        <w:rPr>
+          <w:lang w:val="en"/>
+        </w:rPr>
+        <w:t xml:space="preserve">  -  It saves a DAE copy of the model, with its textures, in a temporary folder on your computer. Your original FBX file </w:t>
+      </w:r>
+      <w:proofErr w:type="gramStart"/>
+      <w:r>
+        <w:rPr>
+          <w:lang w:val="en"/>
+        </w:rPr>
+        <w:t>is</w:t>
+      </w:r>
+      <w:proofErr w:type="gramEnd"/>
+      <w:r>
+        <w:rPr>
+          <w:lang w:val="en"/>
+        </w:rPr>
+        <w:t xml:space="preserve"> never changed.</w:t>
+      </w:r>
+    </w:p>
+    <w:p>
+      <w:pPr>
+        <w:rPr>
+          <w:lang w:val="en"/>
+        </w:rPr>
+      </w:pPr>
+      <w:r>
+        <w:rPr>
+          <w:lang w:val="en"/>
+        </w:rPr>
+        <w:t xml:space="preserve">  -  It converts that copy to Second Life bone names, the same way it does for a Mixamo .dae file.</w:t>
+      </w:r>
+    </w:p>
+    <w:p>
+      <w:pPr>
+        <w:rPr>
+          <w:lang w:val="en"/>
+        </w:rPr>
+      </w:pPr>
+      <w:r>
+        <w:rPr>
+          <w:lang w:val="en"/>
+        </w:rPr>
+        <w:t xml:space="preserve">  -  It turns the model to face the right way. Some tools save a model a quarter turn away from what OpenSim expects. You do not need to fix this yourself.</w:t>
+      </w:r>
+    </w:p>
+    <w:p>
+      <w:pPr>
+        <w:rPr>
+          <w:lang w:val="en"/>
+        </w:rPr>
+      </w:pPr>
+      <w:r>
+        <w:rPr>
+          <w:lang w:val="en"/>
+        </w:rPr>
+        <w:t xml:space="preserve">  -  It sizes the model to match the standard avatar skeleton.</w:t>
+      </w:r>
+    </w:p>
+    <w:p>
+      <w:pPr>
+        <w:rPr>
+          <w:lang w:val="en"/>
+        </w:rPr>
+      </w:pPr>
+      <w:r>
+        <w:rPr>
+          <w:lang w:val="en"/>
+        </w:rPr>
+        <w:t>The Status box reports these steps as they happen, including the full path of the DAE copy it made.</w:t>
+      </w:r>
+    </w:p>
+    <w:p>
+      <w:pPr>
+        <w:rPr>
+          <w:lang w:val="en"/>
+        </w:rPr>
+      </w:pPr>
+      <w:r>
+        <w:rPr>
+          <w:lang w:val="en"/>
+        </w:rPr>
+        <w:t>If you check Clothing or Avatar on an FBX file that has no armature, nothing breaks. The Status box tells you the file has no skeleton, and the model is built as an ordinary object instead.</w:t>
+      </w:r>
+    </w:p>
+    <w:p>
+      <w:pPr>
+        <w:rPr>
+          <w:lang w:val="en"/>
+        </w:rPr>
+      </w:pPr>
+      <w:r>
+        <w:rPr>
+          <w:lang w:val="en"/>
+        </w:rPr>
+        <w:t>Wearable FBX files need Python, just like wearable DAE files. See "Python requirement" below.</w:t>
+      </w:r>
+    </w:p>
+    <w:p>
+      <w:pPr>
+        <w:rPr>
+          <w:lang w:val="en"/>
+        </w:rPr>
+      </w:pPr>
+      <w:r>
+        <w:rPr>
+          <w:lang w:val="en"/>
+        </w:rPr>
+        <w:br w:type="page"/>
+      </w:r>
+    </w:p>
+    <w:p>
+      <w:pPr>
+        <w:pStyle w:val="Heading3"/>
+        <w:rPr>
+          <w:lang w:val="en"/>
+        </w:rPr>
+      </w:pPr>
+      <w:r>
+        <w:rPr>
+          <w:lang w:val="en"/>
+        </w:rPr>
+        <w:t xml:space="preserve">  The model must be in a T-pose</w:t>
+      </w:r>
+    </w:p>
+    <w:p>
+      <w:pPr>
+        <w:rPr>
+          <w:lang w:val="en"/>
+        </w:rPr>
+      </w:pPr>
+      <w:r>
+        <w:rPr>
+          <w:b/>
+          <w:bCs/>
+          <w:lang w:val="en"/>
+        </w:rPr>
         <w:t xml:space="preserve">CAUTION: </w:t>
       </w:r>
       <w:r>
@@ -1301,7 +1997,35 @@
         <w:rPr>
           <w:lang w:val="en"/>
         </w:rPr>
-        <w:t>You do not need to know ahead of time whether a .dae or .fbx file is a Mixamo rig - the Mesh Uploader checks the file’s own bone names for you. A .dae that is already rigged with Second Life or Avastar bone names (for example, one exported straight from Blender with the Avastar add-on) needs no conversion at all, and builds exactly as before even with Clothing checked. Only a file that actually contains Mixamo-style bone names ("mixamorig_...") goes through the conversion step. This means it is safe to leave Clothing checked as your default - it has no effect on a file that does not need it.</w:t>
+        <w:t xml:space="preserve">You do not need to know ahead of time whether a .dae or .fbx file is a Mixamo rig - the Mesh Uploader checks the file’s own bone names for you. A .dae that is already rigged with Second Life or Avastar bone names (for example, one exported straight from Blender with the Avastar add-on) needs no conversion at </w:t>
+      </w:r>
+      <w:proofErr w:type="gramStart"/>
+      <w:r>
+        <w:rPr>
+          <w:lang w:val="en"/>
+        </w:rPr>
+        <w:t>all, and</w:t>
+      </w:r>
+      <w:proofErr w:type="gramEnd"/>
+      <w:r>
+        <w:rPr>
+          <w:lang w:val="en"/>
+        </w:rPr>
+        <w:t xml:space="preserve"> builds exactly as before even with Clothing checked. Only a file that </w:t>
+      </w:r>
+      <w:proofErr w:type="gramStart"/>
+      <w:r>
+        <w:rPr>
+          <w:lang w:val="en"/>
+        </w:rPr>
+        <w:t>actually contains</w:t>
+      </w:r>
+      <w:proofErr w:type="gramEnd"/>
+      <w:r>
+        <w:rPr>
+          <w:lang w:val="en"/>
+        </w:rPr>
+        <w:t xml:space="preserve"> Mixamo-style bone names ("mixamorig_...") goes through the conversion step. This means it is safe to leave Clothing checked as your default - it has no effect on a file that does not need it.</w:t>
       </w:r>
     </w:p>
     <w:p>
@@ -1354,6 +2078,13 @@
         <w:rPr>
           <w:lang w:val="en"/>
         </w:rPr>
+        <w:br w:type="page"/>
+      </w:r>
+      <w:r>
+        <w:rPr>
+          <w:lang w:val="en"/>
+        </w:rPr>
+        <w:lastRenderedPageBreak/>
         <w:t>To install Python on Windows:</w:t>
       </w:r>
     </w:p>
@@ -1411,6 +2142,153 @@
     </w:p>
     <w:p>
       <w:pPr>
+        <w:pStyle w:val="Heading2"/>
+        <w:rPr>
+          <w:lang w:val="en"/>
+        </w:rPr>
+      </w:pPr>
+      <w:r>
+        <w:rPr>
+          <w:lang w:val="en"/>
+        </w:rPr>
+        <w:t>Texture size limits and recommendations</w:t>
+      </w:r>
+    </w:p>
+    <w:p>
+      <w:pPr>
+        <w:rPr>
+          <w:lang w:val="en"/>
+        </w:rPr>
+      </w:pPr>
+      <w:r>
+        <w:rPr>
+          <w:lang w:val="en"/>
+        </w:rPr>
+        <w:t>DreamGrid encodes every texture it uploads to the JPEG2000 format OpenSim requires, and automatically shrinks any texture that is too big:</w:t>
+      </w:r>
+    </w:p>
+    <w:p>
+      <w:pPr>
+        <w:rPr>
+          <w:lang w:val="en"/>
+        </w:rPr>
+      </w:pPr>
+      <w:r>
+        <w:rPr>
+          <w:lang w:val="en"/>
+        </w:rPr>
+        <w:t xml:space="preserve">  -  Ordinary (non-wearable) models: textures are capped at 1024 x 1024 pixels. A bigger texture is automatically shrunk to fit.</w:t>
+      </w:r>
+    </w:p>
+    <w:p>
+      <w:pPr>
+        <w:rPr>
+          <w:lang w:val="en"/>
+        </w:rPr>
+      </w:pPr>
+      <w:r>
+        <w:rPr>
+          <w:lang w:val="en"/>
+        </w:rPr>
+        <w:t xml:space="preserve">  -  Clothing and Avatar uploads: textures are capped at 2048 x 2048 pixels instead. Worn items are usually seen up close, and only ever need to show their first one or two levels of detail in-world, so the extra sharpness is worth the larger file.</w:t>
+      </w:r>
+    </w:p>
+    <w:p>
+      <w:pPr>
+        <w:rPr>
+          <w:lang w:val="en"/>
+        </w:rPr>
+      </w:pPr>
+      <w:r>
+        <w:rPr>
+          <w:lang w:val="en"/>
+        </w:rPr>
+        <w:t>You never need to resize your own textures to hit these numbers - DreamGrid does the shrinking for you. But if you are building or exporting a model yourself, there is no benefit to starting with a texture bigger than 2048 x 2048, since anything larger is cut down anyway. 2048 x 2048 is a safe, allowed size on this grid.</w:t>
+      </w:r>
+    </w:p>
+    <w:p>
+      <w:pPr>
+        <w:pStyle w:val="Heading2"/>
+        <w:rPr>
+          <w:lang w:val="en"/>
+        </w:rPr>
+      </w:pPr>
+      <w:r>
+        <w:rPr>
+          <w:lang w:val="en"/>
+        </w:rPr>
+        <w:t>DAE, FBX, GLTF, and GLB - what is different</w:t>
+      </w:r>
+    </w:p>
+    <w:p>
+      <w:pPr>
+        <w:rPr>
+          <w:lang w:val="en"/>
+        </w:rPr>
+      </w:pPr>
+      <w:r>
+        <w:rPr>
+          <w:lang w:val="en"/>
+        </w:rPr>
+        <w:t>All four formats go through the same OAR-building steps and follow the same vertex and material rules described below, but they are read by different code internally, and one feature is GLTF/GLB only:</w:t>
+      </w:r>
+    </w:p>
+    <w:p>
+      <w:pPr>
+        <w:pStyle w:val="Heading3"/>
+        <w:rPr>
+          <w:lang w:val="en"/>
+        </w:rPr>
+      </w:pPr>
+      <w:r>
+        <w:rPr>
+          <w:lang w:val="en"/>
+        </w:rPr>
+        <w:t xml:space="preserve">  DAE (COLLADA)</w:t>
+      </w:r>
+    </w:p>
+    <w:p>
+      <w:pPr>
+        <w:rPr>
+          <w:lang w:val="en"/>
+        </w:rPr>
+      </w:pPr>
+      <w:r>
+        <w:rPr>
+          <w:lang w:val="en"/>
+        </w:rPr>
+        <w:t xml:space="preserve">    -  Uses a simple diffuse color/texture material model.</w:t>
+      </w:r>
+    </w:p>
+    <w:p>
+      <w:pPr>
+        <w:rPr>
+          <w:lang w:val="en"/>
+        </w:rPr>
+      </w:pPr>
+      <w:r>
+        <w:rPr>
+          <w:lang w:val="en"/>
+        </w:rPr>
+        <w:t xml:space="preserve">    -  Cannot carry PBR (physically based rendering) material data at all - no normal maps, metallic or roughness data, occlusion, or emissive channels are possible from this format on their own. You can still add a </w:t>
+      </w:r>
+      <w:proofErr w:type="gramStart"/>
+      <w:r>
+        <w:rPr>
+          <w:lang w:val="en"/>
+        </w:rPr>
+        <w:t>Normal</w:t>
+      </w:r>
+      <w:proofErr w:type="gramEnd"/>
+      <w:r>
+        <w:rPr>
+          <w:lang w:val="en"/>
+        </w:rPr>
+        <w:t xml:space="preserve"> map or Gloss map to the object once it is in-world.</w:t>
+      </w:r>
+    </w:p>
+    <w:p>
+      <w:pPr>
         <w:rPr>
           <w:lang w:val="en"/>
         </w:rPr>
@@ -1424,6 +2302,151 @@
     </w:p>
     <w:p>
       <w:pPr>
+        <w:pStyle w:val="Heading3"/>
+        <w:rPr>
+          <w:lang w:val="en"/>
+        </w:rPr>
+      </w:pPr>
+      <w:r>
+        <w:rPr>
+          <w:lang w:val="en"/>
+        </w:rPr>
+        <w:t xml:space="preserve">  FBX</w:t>
+      </w:r>
+    </w:p>
+    <w:p>
+      <w:pPr>
+        <w:rPr>
+          <w:lang w:val="en"/>
+        </w:rPr>
+      </w:pPr>
+      <w:r>
+        <w:rPr>
+          <w:lang w:val="en"/>
+        </w:rPr>
+        <w:t xml:space="preserve">    -  Uses the same simple diffuse color/texture material model as DAE. No PBR material data is carried across.</w:t>
+      </w:r>
+    </w:p>
+    <w:p>
+      <w:pPr>
+        <w:rPr>
+          <w:lang w:val="en"/>
+        </w:rPr>
+      </w:pPr>
+      <w:r>
+        <w:rPr>
+          <w:lang w:val="en"/>
+        </w:rPr>
+        <w:t xml:space="preserve">    -  Textures packed inside the FBX file itself are read straight from the file. Textures saved as separate files are read from where the FBX says they are.</w:t>
+      </w:r>
+    </w:p>
+    <w:p>
+      <w:pPr>
+        <w:rPr>
+          <w:lang w:val="en"/>
+        </w:rPr>
+      </w:pPr>
+      <w:r>
+        <w:rPr>
+          <w:lang w:val="en"/>
+        </w:rPr>
+        <w:t xml:space="preserve">    -  Sizes are converted to meters automatically, whatever unit the file was saved in.</w:t>
+      </w:r>
+    </w:p>
+    <w:p>
+      <w:pPr>
+        <w:rPr>
+          <w:lang w:val="en"/>
+        </w:rPr>
+      </w:pPr>
+      <w:r>
+        <w:rPr>
+          <w:lang w:val="en"/>
+        </w:rPr>
+        <w:t xml:space="preserve">    -  Can carry an armature. See "FBX files and armatures" above.</w:t>
+      </w:r>
+    </w:p>
+    <w:p>
+      <w:pPr>
+        <w:pStyle w:val="Heading3"/>
+        <w:rPr>
+          <w:lang w:val="en"/>
+        </w:rPr>
+      </w:pPr>
+      <w:r>
+        <w:rPr>
+          <w:lang w:val="en"/>
+        </w:rPr>
+        <w:t xml:space="preserve">  GLTF (.gltf, JSON plus side files) and GLB (.glb, one packed file)</w:t>
+      </w:r>
+    </w:p>
+    <w:p>
+      <w:pPr>
+        <w:rPr>
+          <w:lang w:val="en"/>
+        </w:rPr>
+      </w:pPr>
+      <w:r>
+        <w:rPr>
+          <w:lang w:val="en"/>
+        </w:rPr>
+        <w:t xml:space="preserve">    -  Carries full PBR material support: base color, normal map, metallic/roughness, occlusion, and emissive channels are all read from the source file and carried into the built OAR.</w:t>
+      </w:r>
+    </w:p>
+    <w:p>
+      <w:pPr>
+        <w:rPr>
+          <w:lang w:val="en"/>
+        </w:rPr>
+      </w:pPr>
+      <w:r>
+        <w:rPr>
+          <w:lang w:val="en"/>
+        </w:rPr>
+        <w:t xml:space="preserve">    -  A single part of a GLTF/GLB file can use more than one material at once (for example, a tire model with a "Tireside" material and a separate "Tiretread" material on the same part) - the uploader keeps each part’s own material correct, rather than forcing the whole part to use just one material.</w:t>
+      </w:r>
+    </w:p>
+    <w:p>
+      <w:pPr>
+        <w:rPr>
+          <w:lang w:val="en"/>
+        </w:rPr>
+      </w:pPr>
+      <w:r>
+        <w:rPr>
+          <w:lang w:val="en"/>
+        </w:rPr>
+        <w:t xml:space="preserve">    -  A material reused many times across one model (for example, the same lug-nut material on eight identical lug nuts) is only extracted and uploaded once, then reused - not uploaded again for every occurrence.</w:t>
+      </w:r>
+    </w:p>
+    <w:p>
+      <w:pPr>
+        <w:rPr>
+          <w:lang w:val="en"/>
+        </w:rPr>
+      </w:pPr>
+      <w:r>
+        <w:rPr>
+          <w:lang w:val="en"/>
+        </w:rPr>
+        <w:t xml:space="preserve">    -  .dae, .fbx, .gltf, and .glb models all show up in the live embedded 3D preview panel inside the Mesh Uploader window itself.</w:t>
+      </w:r>
+    </w:p>
+    <w:p>
+      <w:pPr>
+        <w:rPr>
+          <w:lang w:val="en"/>
+        </w:rPr>
+      </w:pPr>
+      <w:r>
+        <w:rPr>
+          <w:lang w:val="en"/>
+        </w:rPr>
+        <w:t>Multi-part models (several linked prims in one file) are supported for every format - the uploader builds a real linkset out of all the model’s parts, not just a single piece.</w:t>
+      </w:r>
+    </w:p>
+    <w:p>
+      <w:pPr>
         <w:pStyle w:val="Heading2"/>
         <w:rPr>
           <w:lang w:val="en"/>
@@ -1433,59 +2456,169 @@
         <w:rPr>
           <w:lang w:val="en"/>
         </w:rPr>
-        <w:t>Texture size limits and recommendations</w:t>
-      </w:r>
-    </w:p>
-    <w:p>
-      <w:pPr>
-        <w:rPr>
-          <w:lang w:val="en"/>
-        </w:rPr>
-      </w:pPr>
-      <w:r>
-        <w:rPr>
-          <w:lang w:val="en"/>
-        </w:rPr>
-        <w:t>DreamGrid encodes every texture it uploads to the JPEG2000 format OpenSim requires, and automatically shrinks any texture that is too big:</w:t>
-      </w:r>
-    </w:p>
-    <w:p>
-      <w:pPr>
-        <w:rPr>
-          <w:lang w:val="en"/>
-        </w:rPr>
-      </w:pPr>
-      <w:r>
-        <w:rPr>
-          <w:lang w:val="en"/>
-        </w:rPr>
-        <w:t xml:space="preserve">  -  Ordinary (non-wearable) models: textures are capped at 1024 x 1024 pixels. A bigger texture is automatically shrunk to fit.</w:t>
-      </w:r>
-    </w:p>
-    <w:p>
-      <w:pPr>
-        <w:rPr>
-          <w:lang w:val="en"/>
-        </w:rPr>
-      </w:pPr>
-      <w:r>
-        <w:rPr>
-          <w:lang w:val="en"/>
-        </w:rPr>
-        <w:t xml:space="preserve">  -  Clothing and Avatar uploads: textures are capped at 2048 x 2048 pixels instead. Worn items are usually seen up close, and only ever need to show their first one or two levels of detail in-world, so the extra sharpness is worth the larger file.</w:t>
-      </w:r>
-    </w:p>
-    <w:p>
-      <w:pPr>
-        <w:rPr>
-          <w:lang w:val="en"/>
-        </w:rPr>
-      </w:pPr>
-      <w:r>
-        <w:rPr>
-          <w:lang w:val="en"/>
-        </w:rPr>
-        <w:t>You never need to resize your own textures to hit these numbers - DreamGrid does the shrinking for you. But if you are building or exporting a model yourself, there is no benefit to starting with a texture bigger than 2048 x 2048, since anything larger is cut down anyway. 2048 x 2048 is a safe, allowed size on this grid.</w:t>
+        <w:t>Recommendations by source</w:t>
+      </w:r>
+    </w:p>
+    <w:p>
+      <w:pPr>
+        <w:rPr>
+          <w:lang w:val="en"/>
+        </w:rPr>
+      </w:pPr>
+      <w:r>
+        <w:rPr>
+          <w:lang w:val="en"/>
+        </w:rPr>
+        <w:t xml:space="preserve">  -  Raw Mixamo </w:t>
+      </w:r>
+      <w:proofErr w:type="gramStart"/>
+      <w:r>
+        <w:rPr>
+          <w:lang w:val="en"/>
+        </w:rPr>
+        <w:t>exports (.</w:t>
+      </w:r>
+      <w:proofErr w:type="gramEnd"/>
+      <w:r>
+        <w:rPr>
+          <w:lang w:val="en"/>
+        </w:rPr>
+        <w:t xml:space="preserve">dae or .fbx downloaded directly from the Mixamo website): use Clothing or Avatar as needed. These are the </w:t>
+      </w:r>
+      <w:proofErr w:type="gramStart"/>
+      <w:r>
+        <w:rPr>
+          <w:lang w:val="en"/>
+        </w:rPr>
+        <w:t>file</w:t>
+      </w:r>
+      <w:proofErr w:type="gramEnd"/>
+      <w:r>
+        <w:rPr>
+          <w:lang w:val="en"/>
+        </w:rPr>
+        <w:t xml:space="preserve"> DreamGrid’s Mixamo conversion is built and tested against, and they work well end to end.</w:t>
+      </w:r>
+    </w:p>
+    <w:p>
+      <w:pPr>
+        <w:rPr>
+          <w:lang w:val="en"/>
+        </w:rPr>
+      </w:pPr>
+      <w:r>
+        <w:rPr>
+          <w:lang w:val="en"/>
+        </w:rPr>
+        <w:t xml:space="preserve">  -  Mixamo .dae or .fbx - which to </w:t>
+      </w:r>
+      <w:proofErr w:type="gramStart"/>
+      <w:r>
+        <w:rPr>
+          <w:lang w:val="en"/>
+        </w:rPr>
+        <w:t>pick:</w:t>
+      </w:r>
+      <w:proofErr w:type="gramEnd"/>
+      <w:r>
+        <w:rPr>
+          <w:lang w:val="en"/>
+        </w:rPr>
+        <w:t xml:space="preserve"> both </w:t>
+      </w:r>
+      <w:proofErr w:type="gramStart"/>
+      <w:r>
+        <w:rPr>
+          <w:lang w:val="en"/>
+        </w:rPr>
+        <w:t>work</w:t>
+      </w:r>
+      <w:proofErr w:type="gramEnd"/>
+      <w:r>
+        <w:rPr>
+          <w:lang w:val="en"/>
+        </w:rPr>
+        <w:t>. One Mixamo character was seen with its eyes out of place in the .dae download and correct in the .fbx download. If a .dae looks wrong, try the .fbx of the same character.</w:t>
+      </w:r>
+    </w:p>
+    <w:p>
+      <w:pPr>
+        <w:rPr>
+          <w:lang w:val="en"/>
+        </w:rPr>
+      </w:pPr>
+      <w:r>
+        <w:rPr>
+          <w:lang w:val="en"/>
+        </w:rPr>
+        <w:t xml:space="preserve">  -  Tripo3D and other AI model generators (.fbx): supported, including rigged models. Create the model in a T-pose if you plan to wear it - see "FBX files and armatures" above.</w:t>
+      </w:r>
+    </w:p>
+    <w:p>
+      <w:pPr>
+        <w:rPr>
+          <w:lang w:val="en"/>
+        </w:rPr>
+      </w:pPr>
+      <w:r>
+        <w:rPr>
+          <w:lang w:val="en"/>
+        </w:rPr>
+        <w:lastRenderedPageBreak/>
+        <w:t xml:space="preserve">  -  Mixamo models re-saved through Blender: not currently supported by the automatic conversion. Blender puts extra scale and position data on a part of the file the converter does not read, so the result comes out the wrong size. Use the raw file straight from Mixamo instead if you can.</w:t>
+      </w:r>
+    </w:p>
+    <w:p>
+      <w:pPr>
+        <w:rPr>
+          <w:lang w:val="en"/>
+        </w:rPr>
+      </w:pPr>
+      <w:r>
+        <w:rPr>
+          <w:lang w:val="en"/>
+        </w:rPr>
+        <w:t xml:space="preserve">  -  Blender/Avastar exports (already rigged with Second Life bone names): leave Clothing checked - it is detected as already-correct and </w:t>
+      </w:r>
+      <w:proofErr w:type="gramStart"/>
+      <w:r>
+        <w:rPr>
+          <w:lang w:val="en"/>
+        </w:rPr>
+        <w:t>passed through</w:t>
+      </w:r>
+      <w:proofErr w:type="gramEnd"/>
+      <w:r>
+        <w:rPr>
+          <w:lang w:val="en"/>
+        </w:rPr>
+        <w:t xml:space="preserve"> untouched, so it is always safe to leave on.</w:t>
+      </w:r>
+    </w:p>
+    <w:p>
+      <w:pPr>
+        <w:rPr>
+          <w:lang w:val="en"/>
+        </w:rPr>
+      </w:pPr>
+      <w:r>
+        <w:rPr>
+          <w:lang w:val="en"/>
+        </w:rPr>
+        <w:t xml:space="preserve">  -  GLB from any other source (game asset stores, photogrammetry scans, CAD exports, and so on): prefer GLB over separate GLTF-plus-textures where you have the choice. It is one self-contained file, so nothing can go missing between the model and its textures.</w:t>
+      </w:r>
+    </w:p>
+    <w:p>
+      <w:pPr>
+        <w:rPr>
+          <w:lang w:val="en"/>
+        </w:rPr>
+      </w:pPr>
+      <w:r>
+        <w:rPr>
+          <w:lang w:val="en"/>
+        </w:rPr>
+        <w:t xml:space="preserve">  -  Very large or very detailed models: split them into more materials rather than fewer. See the vertex-limit section below.</w:t>
       </w:r>
     </w:p>
     <w:p>
@@ -1499,323 +2632,6 @@
         <w:rPr>
           <w:lang w:val="en"/>
         </w:rPr>
-        <w:t>DAE, FBX, GLTF, and GLB - what is different</w:t>
-      </w:r>
-    </w:p>
-    <w:p>
-      <w:pPr>
-        <w:rPr>
-          <w:lang w:val="en"/>
-        </w:rPr>
-      </w:pPr>
-      <w:r>
-        <w:rPr>
-          <w:lang w:val="en"/>
-        </w:rPr>
-        <w:t>All four formats go through the same OAR-building steps and follow the same vertex and material rules described below, but they are read by different code internally, and one feature is GLTF/GLB only:</w:t>
-      </w:r>
-    </w:p>
-    <w:p>
-      <w:pPr>
-        <w:pStyle w:val="Heading3"/>
-        <w:rPr>
-          <w:lang w:val="en"/>
-        </w:rPr>
-      </w:pPr>
-      <w:r>
-        <w:rPr>
-          <w:lang w:val="en"/>
-        </w:rPr>
-        <w:t xml:space="preserve">  DAE (COLLADA)</w:t>
-      </w:r>
-    </w:p>
-    <w:p>
-      <w:pPr>
-        <w:rPr>
-          <w:lang w:val="en"/>
-        </w:rPr>
-      </w:pPr>
-      <w:r>
-        <w:rPr>
-          <w:lang w:val="en"/>
-        </w:rPr>
-        <w:t xml:space="preserve">    -  Uses a simple diffuse color/texture material model.</w:t>
-      </w:r>
-    </w:p>
-    <w:p>
-      <w:pPr>
-        <w:rPr>
-          <w:lang w:val="en"/>
-        </w:rPr>
-      </w:pPr>
-      <w:r>
-        <w:rPr>
-          <w:lang w:val="en"/>
-        </w:rPr>
-        <w:t xml:space="preserve">    -  Cannot carry PBR (physically based rendering) material data at all - no normal maps, metallic or roughness data, occlusion, or emissive channels are possible from this format on their own. You can still add a Normal map or Gloss map to the object once it is in-world.</w:t>
-      </w:r>
-    </w:p>
-    <w:p>
-      <w:pPr>
-        <w:pStyle w:val="Heading3"/>
-        <w:rPr>
-          <w:lang w:val="en"/>
-        </w:rPr>
-      </w:pPr>
-      <w:r>
-        <w:rPr>
-          <w:lang w:val="en"/>
-        </w:rPr>
-        <w:t xml:space="preserve">  FBX</w:t>
-      </w:r>
-    </w:p>
-    <w:p>
-      <w:pPr>
-        <w:rPr>
-          <w:lang w:val="en"/>
-        </w:rPr>
-      </w:pPr>
-      <w:r>
-        <w:rPr>
-          <w:lang w:val="en"/>
-        </w:rPr>
-        <w:t xml:space="preserve">    -  Uses the same simple diffuse color/texture material model as DAE. No PBR material data is carried across.</w:t>
-      </w:r>
-    </w:p>
-    <w:p>
-      <w:pPr>
-        <w:rPr>
-          <w:lang w:val="en"/>
-        </w:rPr>
-      </w:pPr>
-      <w:r>
-        <w:rPr>
-          <w:lang w:val="en"/>
-        </w:rPr>
-        <w:t xml:space="preserve">    -  Textures packed inside the FBX file itself are read straight from the file. Textures saved as separate files are read from where the FBX says they are.</w:t>
-      </w:r>
-    </w:p>
-    <w:p>
-      <w:pPr>
-        <w:rPr>
-          <w:lang w:val="en"/>
-        </w:rPr>
-      </w:pPr>
-      <w:r>
-        <w:rPr>
-          <w:lang w:val="en"/>
-        </w:rPr>
-        <w:t xml:space="preserve">    -  Sizes are converted to meters automatically, whatever unit the file was saved in.</w:t>
-      </w:r>
-    </w:p>
-    <w:p>
-      <w:pPr>
-        <w:rPr>
-          <w:lang w:val="en"/>
-        </w:rPr>
-      </w:pPr>
-      <w:r>
-        <w:rPr>
-          <w:lang w:val="en"/>
-        </w:rPr>
-        <w:t xml:space="preserve">    -  Can carry an armature. See "FBX files and armatures" above.</w:t>
-      </w:r>
-    </w:p>
-    <w:p>
-      <w:pPr>
-        <w:pStyle w:val="Heading3"/>
-        <w:rPr>
-          <w:lang w:val="en"/>
-        </w:rPr>
-      </w:pPr>
-      <w:r>
-        <w:rPr>
-          <w:lang w:val="en"/>
-        </w:rPr>
-        <w:t xml:space="preserve">  GLTF (.gltf, JSON plus side files) and GLB (.glb, one packed file)</w:t>
-      </w:r>
-    </w:p>
-    <w:p>
-      <w:pPr>
-        <w:rPr>
-          <w:lang w:val="en"/>
-        </w:rPr>
-      </w:pPr>
-      <w:r>
-        <w:rPr>
-          <w:lang w:val="en"/>
-        </w:rPr>
-        <w:t xml:space="preserve">    -  Carries full PBR material support: base color, normal map, metallic/roughness, occlusion, and emissive channels are all read from the source file and carried into the built OAR.</w:t>
-      </w:r>
-    </w:p>
-    <w:p>
-      <w:pPr>
-        <w:rPr>
-          <w:lang w:val="en"/>
-        </w:rPr>
-      </w:pPr>
-      <w:r>
-        <w:rPr>
-          <w:lang w:val="en"/>
-        </w:rPr>
-        <w:t xml:space="preserve">    -  A single part of a GLTF/GLB file can use more than one material at once (for example, a tire model with a "Tireside" material and a separate "Tiretread" material on the same part) - the uploader keeps each part’s own material correct, rather than forcing the whole part to use just one material.</w:t>
-      </w:r>
-    </w:p>
-    <w:p>
-      <w:pPr>
-        <w:rPr>
-          <w:lang w:val="en"/>
-        </w:rPr>
-      </w:pPr>
-      <w:r>
-        <w:rPr>
-          <w:lang w:val="en"/>
-        </w:rPr>
-        <w:t xml:space="preserve">    -  A material reused many times across one model (for example, the same lug-nut material on eight identical lug nuts) is only extracted and uploaded once, then reused - not uploaded again for every occurrence.</w:t>
-      </w:r>
-    </w:p>
-    <w:p>
-      <w:pPr>
-        <w:rPr>
-          <w:lang w:val="en"/>
-        </w:rPr>
-      </w:pPr>
-      <w:r>
-        <w:rPr>
-          <w:lang w:val="en"/>
-        </w:rPr>
-        <w:t xml:space="preserve">    -  .dae, .fbx, .gltf, and .glb models all show up in the live embedded 3D preview panel inside the Mesh Uploader window itself.</w:t>
-      </w:r>
-    </w:p>
-    <w:p>
-      <w:pPr>
-        <w:rPr>
-          <w:lang w:val="en"/>
-        </w:rPr>
-      </w:pPr>
-      <w:r>
-        <w:rPr>
-          <w:lang w:val="en"/>
-        </w:rPr>
-        <w:t>Multi-part models (several linked prims in one file) are supported for every format - the uploader builds a real linkset out of all the model’s parts, not just a single piece.</w:t>
-      </w:r>
-    </w:p>
-    <w:p>
-      <w:pPr>
-        <w:pStyle w:val="Heading2"/>
-        <w:rPr>
-          <w:lang w:val="en"/>
-        </w:rPr>
-      </w:pPr>
-      <w:r>
-        <w:rPr>
-          <w:lang w:val="en"/>
-        </w:rPr>
-        <w:t>Recommendations by source</w:t>
-      </w:r>
-    </w:p>
-    <w:p>
-      <w:pPr>
-        <w:rPr>
-          <w:lang w:val="en"/>
-        </w:rPr>
-      </w:pPr>
-      <w:r>
-        <w:rPr>
-          <w:lang w:val="en"/>
-        </w:rPr>
-        <w:t xml:space="preserve">  -  Raw Mixamo exports (.dae or .fbx downloaded directly from the Mixamo website): use Clothing or Avatar as needed. These are the file DreamGrid’s Mixamo conversion is built and tested against, and they work well end to end.</w:t>
-      </w:r>
-    </w:p>
-    <w:p>
-      <w:pPr>
-        <w:rPr>
-          <w:lang w:val="en"/>
-        </w:rPr>
-      </w:pPr>
-      <w:r>
-        <w:rPr>
-          <w:lang w:val="en"/>
-        </w:rPr>
-        <w:t xml:space="preserve">  -  Mixamo .dae or .fbx - which to pick: both work. One Mixamo character was seen with its eyes out of place in the .dae download and correct in the .fbx download. If a .dae looks wrong, try the .fbx of the same character.</w:t>
-      </w:r>
-    </w:p>
-    <w:p>
-      <w:pPr>
-        <w:rPr>
-          <w:lang w:val="en"/>
-        </w:rPr>
-      </w:pPr>
-      <w:r>
-        <w:rPr>
-          <w:lang w:val="en"/>
-        </w:rPr>
-        <w:t xml:space="preserve">  -  Tripo3D and other AI model generators (.fbx): supported, including rigged models. Create the model in a T-pose if you plan to wear it - see "FBX files and armatures" above.</w:t>
-      </w:r>
-    </w:p>
-    <w:p>
-      <w:pPr>
-        <w:rPr>
-          <w:lang w:val="en"/>
-        </w:rPr>
-      </w:pPr>
-      <w:r>
-        <w:rPr>
-          <w:lang w:val="en"/>
-        </w:rPr>
-        <w:t xml:space="preserve">  -  Mixamo models re-saved through Blender: not currently supported by the automatic conversion. Blender puts extra scale and position data on a part of the file the converter does not read, so the result comes out the wrong size. Use the raw file straight from Mixamo instead if you can.</w:t>
-      </w:r>
-    </w:p>
-    <w:p>
-      <w:pPr>
-        <w:rPr>
-          <w:lang w:val="en"/>
-        </w:rPr>
-      </w:pPr>
-      <w:r>
-        <w:rPr>
-          <w:lang w:val="en"/>
-        </w:rPr>
-        <w:t xml:space="preserve">  -  Blender/Avastar exports (already rigged with Second Life bone names): leave Clothing checked - it is detected as already-correct and passed through untouched, so it is always safe to leave on.</w:t>
-      </w:r>
-    </w:p>
-    <w:p>
-      <w:pPr>
-        <w:rPr>
-          <w:lang w:val="en"/>
-        </w:rPr>
-      </w:pPr>
-      <w:r>
-        <w:rPr>
-          <w:lang w:val="en"/>
-        </w:rPr>
-        <w:t xml:space="preserve">  -  GLB from any other source (game asset stores, photogrammetry scans, CAD exports, and so on): prefer GLB over separate GLTF-plus-textures where you have the choice. It is one self-contained file, so nothing can go missing between the model and its textures.</w:t>
-      </w:r>
-    </w:p>
-    <w:p>
-      <w:pPr>
-        <w:rPr>
-          <w:lang w:val="en"/>
-        </w:rPr>
-      </w:pPr>
-      <w:r>
-        <w:rPr>
-          <w:lang w:val="en"/>
-        </w:rPr>
-        <w:t xml:space="preserve">  -  Very large or very detailed models: split them into more materials rather than fewer. See the vertex-limit section below.</w:t>
-      </w:r>
-    </w:p>
-    <w:p>
-      <w:pPr>
-        <w:pStyle w:val="Heading2"/>
-        <w:rPr>
-          <w:lang w:val="en"/>
-        </w:rPr>
-      </w:pPr>
-      <w:r>
-        <w:rPr>
-          <w:lang w:val="en"/>
-        </w:rPr>
         <w:t>The 16-bit vertex limit - why it matters</w:t>
       </w:r>
     </w:p>
@@ -1881,37 +2697,40 @@
         <w:rPr>
           <w:lang w:val="en"/>
         </w:rPr>
-        <w:br w:type="page"/>
-      </w:r>
-    </w:p>
-    <w:p>
-      <w:pPr>
-        <w:rPr>
-          <w:lang w:val="en"/>
-        </w:rPr>
-      </w:pPr>
-      <w:r>
-        <w:rPr>
-          <w:lang w:val="en"/>
-        </w:rPr>
         <w:t>In short:</w:t>
       </w:r>
     </w:p>
     <w:p>
       <w:pPr>
-        <w:rPr>
-          <w:lang w:val="en"/>
-        </w:rPr>
-      </w:pPr>
-      <w:r>
-        <w:rPr>
-          <w:lang w:val="en"/>
-        </w:rPr>
-        <w:t xml:space="preserve">  -  Hard limit:       65,535 vertices per material - the build fails.</w:t>
-      </w:r>
-    </w:p>
-    <w:p>
-      <w:pPr>
+        <w:ind w:left="720" w:hanging="720"/>
+        <w:rPr>
+          <w:lang w:val="en"/>
+        </w:rPr>
+      </w:pPr>
+      <w:r>
+        <w:rPr>
+          <w:lang w:val="en"/>
+        </w:rPr>
+        <w:t xml:space="preserve">  -  Hard limit:       65,535 vertices per material - the </w:t>
+      </w:r>
+      <w:proofErr w:type="gramStart"/>
+      <w:r>
+        <w:rPr>
+          <w:lang w:val="en"/>
+        </w:rPr>
+        <w:t>build</w:t>
+      </w:r>
+      <w:proofErr w:type="gramEnd"/>
+      <w:r>
+        <w:rPr>
+          <w:lang w:val="en"/>
+        </w:rPr>
+        <w:t xml:space="preserve"> fails.</w:t>
+      </w:r>
+    </w:p>
+    <w:p>
+      <w:pPr>
+        <w:ind w:left="720" w:hanging="720"/>
         <w:rPr>
           <w:lang w:val="en"/>
         </w:rPr>
@@ -1925,6 +2744,7 @@
     </w:p>
     <w:p>
       <w:pPr>
+        <w:ind w:left="720" w:hanging="720"/>
         <w:rPr>
           <w:lang w:val="en"/>
         </w:rPr>
@@ -1948,6 +2768,7 @@
         <w:rPr>
           <w:lang w:val="en"/>
         </w:rPr>
+        <w:lastRenderedPageBreak/>
         <w:t>Letting users upload mesh from the web</w:t>
       </w:r>
     </w:p>
@@ -1974,11 +2795,29 @@
         <w:rPr>
           <w:lang w:val="en"/>
         </w:rPr>
-        <w:t>This is switched off when DreamGrid is installed. To switch it on, do both of these steps:</w:t>
-      </w:r>
-    </w:p>
-    <w:p>
-      <w:pPr>
+        <w:t xml:space="preserve">This is switched off when DreamGrid is installed. To switch it on, do </w:t>
+      </w:r>
+      <w:proofErr w:type="gramStart"/>
+      <w:r>
+        <w:rPr>
+          <w:lang w:val="en"/>
+        </w:rPr>
+        <w:t>both of these</w:t>
+      </w:r>
+      <w:proofErr w:type="gramEnd"/>
+      <w:r>
+        <w:rPr>
+          <w:lang w:val="en"/>
+        </w:rPr>
+        <w:t xml:space="preserve"> steps:</w:t>
+      </w:r>
+    </w:p>
+    <w:p>
+      <w:pPr>
+        <w:tabs>
+          <w:tab w:val="left" w:pos="90"/>
+        </w:tabs>
+        <w:ind w:left="720" w:hanging="810"/>
         <w:rPr>
           <w:lang w:val="en"/>
         </w:rPr>
@@ -1992,6 +2831,10 @@
     </w:p>
     <w:p>
       <w:pPr>
+        <w:tabs>
+          <w:tab w:val="left" w:pos="90"/>
+        </w:tabs>
+        <w:ind w:left="720" w:hanging="810"/>
         <w:rPr>
           <w:lang w:val="en"/>
         </w:rPr>
@@ -2082,7 +2925,21 @@
         <w:rPr>
           <w:lang w:val="en"/>
         </w:rPr>
-        <w:t xml:space="preserve">  1.  Log in to the grid with a viewer, and stand where the mesh should go.</w:t>
+        <w:t xml:space="preserve">  1.  Log in to the grid with a </w:t>
+      </w:r>
+      <w:proofErr w:type="gramStart"/>
+      <w:r>
+        <w:rPr>
+          <w:lang w:val="en"/>
+        </w:rPr>
+        <w:t>viewer, and</w:t>
+      </w:r>
+      <w:proofErr w:type="gramEnd"/>
+      <w:r>
+        <w:rPr>
+          <w:lang w:val="en"/>
+        </w:rPr>
+        <w:t xml:space="preserve"> stand where the mesh should go.</w:t>
       </w:r>
     </w:p>
     <w:p>
@@ -2121,7 +2978,21 @@
         <w:rPr>
           <w:lang w:val="en"/>
         </w:rPr>
-        <w:t xml:space="preserve">  4.  Choose the model file and its texture files together. The model turns in a 3D preview. If a texture was left out, the page names it.</w:t>
+        <w:t xml:space="preserve">  4.  Choose the model file and its texture files together. The model turns </w:t>
+      </w:r>
+      <w:proofErr w:type="gramStart"/>
+      <w:r>
+        <w:rPr>
+          <w:lang w:val="en"/>
+        </w:rPr>
+        <w:t>in</w:t>
+      </w:r>
+      <w:proofErr w:type="gramEnd"/>
+      <w:r>
+        <w:rPr>
+          <w:lang w:val="en"/>
+        </w:rPr>
+        <w:t xml:space="preserve"> a 3D preview. If a texture was left out, the page names it.</w:t>
       </w:r>
     </w:p>
     <w:p>
@@ -2147,20 +3018,61 @@
         <w:rPr>
           <w:lang w:val="en"/>
         </w:rPr>
-        <w:t xml:space="preserve">  6.  Click “Upload and place in world”, and watch the progress lines.</w:t>
-      </w:r>
-    </w:p>
-    <w:p>
-      <w:pPr>
-        <w:rPr>
-          <w:lang w:val="en"/>
-        </w:rPr>
-      </w:pPr>
-      <w:r>
-        <w:rPr>
-          <w:lang w:val="en"/>
-        </w:rPr>
-        <w:t>To wear clothing or an avatar, the user right-clicks the object in world, chooses Take, then wears it from their inventory.</w:t>
+        <w:t xml:space="preserve">  6.  Click “Upload and place in world</w:t>
+      </w:r>
+      <w:proofErr w:type="gramStart"/>
+      <w:r>
+        <w:rPr>
+          <w:lang w:val="en"/>
+        </w:rPr>
+        <w:t>”, and</w:t>
+      </w:r>
+      <w:proofErr w:type="gramEnd"/>
+      <w:r>
+        <w:rPr>
+          <w:lang w:val="en"/>
+        </w:rPr>
+        <w:t xml:space="preserve"> watch the progress lines.</w:t>
+      </w:r>
+    </w:p>
+    <w:p>
+      <w:pPr>
+        <w:rPr>
+          <w:lang w:val="en"/>
+        </w:rPr>
+      </w:pPr>
+      <w:r>
+        <w:rPr>
+          <w:lang w:val="en"/>
+        </w:rPr>
+        <w:t xml:space="preserve">To wear clothing or an avatar, the </w:t>
+      </w:r>
+      <w:proofErr w:type="gramStart"/>
+      <w:r>
+        <w:rPr>
+          <w:lang w:val="en"/>
+        </w:rPr>
+        <w:t>user right-</w:t>
+      </w:r>
+      <w:proofErr w:type="gramEnd"/>
+      <w:r>
+        <w:rPr>
+          <w:lang w:val="en"/>
+        </w:rPr>
+        <w:t>clicks the object in world, chooses Take, then wears it from their inventory.</w:t>
+      </w:r>
+    </w:p>
+    <w:p>
+      <w:pPr>
+        <w:rPr>
+          <w:lang w:val="en"/>
+        </w:rPr>
+      </w:pPr>
+      <w:r>
+        <w:rPr>
+          <w:lang w:val="en"/>
+        </w:rPr>
+        <w:br w:type="page"/>
       </w:r>
     </w:p>
     <w:p>
@@ -2240,7 +3152,21 @@
         <w:rPr>
           <w:lang w:val="en"/>
         </w:rPr>
-        <w:t>Uploaded files are kept in a folder that cannot be reached from the web. They are deleted when the build ends.</w:t>
+        <w:t xml:space="preserve">Uploaded files are kept in a folder that cannot be reached from the web. They are deleted when the </w:t>
+      </w:r>
+      <w:proofErr w:type="gramStart"/>
+      <w:r>
+        <w:rPr>
+          <w:lang w:val="en"/>
+        </w:rPr>
+        <w:t>build</w:t>
+      </w:r>
+      <w:proofErr w:type="gramEnd"/>
+      <w:r>
+        <w:rPr>
+          <w:lang w:val="en"/>
+        </w:rPr>
+        <w:t xml:space="preserve"> ends.</w:t>
       </w:r>
     </w:p>
     <w:p>
@@ -2301,7 +3227,7 @@
         <w:rPr>
           <w:lang w:val="en"/>
         </w:rPr>
-        <w:t xml:space="preserve">Zips in the folder are taken too. Each zip is unpacked on its own into a temporary folder under OutworldzFiles\tmp, the model inside is built and loaded, and the temporary folder is removed before the next file is started. A zip that holds more than one model builds the one nearest its top; the Status box names it. This is the way to load a whole set of avatars that arrived as zips: put them in one folder and let it run.</w:t>
+        <w:t>Zips in the folder are taken too. Each zip is unpacked on its own into a temporary folder under OutworldzFiles\tmp, the model inside is built and loaded, and the temporary folder is removed before the next file is started. A zip that holds more than one model builds the one nearest its top; the Status box names it. This is the way to load a whole set of avatars that arrived as zips: put them in one folder and let it run.</w:t>
       </w:r>
     </w:p>
     <w:p>
@@ -2327,7 +3253,21 @@
         <w:rPr>
           <w:lang w:val="en"/>
         </w:rPr>
-        <w:t>Note: in folder mode there is no single mesh to measure, so the avatar-gaze placement described above is skipped - only the X/Y start position and region come from the avatar or region fields.</w:t>
+        <w:t xml:space="preserve">Note: in folder mode there is no single mesh to measure, so the avatar-gaze placement described above is skipped - only the X/Y start position and region </w:t>
+      </w:r>
+      <w:proofErr w:type="gramStart"/>
+      <w:r>
+        <w:rPr>
+          <w:lang w:val="en"/>
+        </w:rPr>
+        <w:t>come</w:t>
+      </w:r>
+      <w:proofErr w:type="gramEnd"/>
+      <w:r>
+        <w:rPr>
+          <w:lang w:val="en"/>
+        </w:rPr>
+        <w:t xml:space="preserve"> from the avatar or region fields.</w:t>
       </w:r>
     </w:p>
     <w:p>
@@ -2354,7 +3294,21 @@
         <w:rPr>
           <w:lang w:val="en"/>
         </w:rPr>
-        <w:t>Some models are large enough that the built-in preview camera cannot zoom out far enough to show the whole thing, even scrolled all the way out. This is a limit of the preview window’s camera only - it has nothing to do with the size of the object that gets uploaded, and nothing to do with the Scale field. DreamGrid widens this camera limit automatically based on each model’s own size once it loads, so this should now be rare. If you still cannot see a model properly in preview, use the Preview button’s full GltfViewer window instead, or simply build and load it - the preview camera limit has no effect on the object once it is in-world.</w:t>
+        <w:t xml:space="preserve">Some models are large enough that the built-in preview camera cannot zoom out far enough to show the whole thing, even scrolled all the way out. This is </w:t>
+      </w:r>
+      <w:proofErr w:type="gramStart"/>
+      <w:r>
+        <w:rPr>
+          <w:lang w:val="en"/>
+        </w:rPr>
+        <w:t>a limit</w:t>
+      </w:r>
+      <w:proofErr w:type="gramEnd"/>
+      <w:r>
+        <w:rPr>
+          <w:lang w:val="en"/>
+        </w:rPr>
+        <w:t xml:space="preserve"> of the preview window’s camera only - it has nothing to do with the size of the object that gets uploaded, and nothing to do with the Scale field. DreamGrid widens this camera limit automatically based on each model’s own size once it loads, so this should now be rare. If you still cannot see a model properly in preview, use the Preview button’s full GltfViewer window instead, or simply build and load it - the preview camera limit has no effect on the object once it is in-world.</w:t>
       </w:r>
     </w:p>
     <w:p>
@@ -2446,7 +3400,21 @@
         <w:rPr>
           <w:lang w:val="en"/>
         </w:rPr>
-        <w:t xml:space="preserve">  -  Leave Clothing checked by default if you plan to upload Mixamo characters - it has no effect on a file that does not need converting, and saves you a step on the ones that do.</w:t>
+        <w:t xml:space="preserve">  -  Leave Clothing checked by default if you plan to upload Mixamo characters - it has no effect on a file that does not need </w:t>
+      </w:r>
+      <w:proofErr w:type="gramStart"/>
+      <w:r>
+        <w:rPr>
+          <w:lang w:val="en"/>
+        </w:rPr>
+        <w:t>converting, and</w:t>
+      </w:r>
+      <w:proofErr w:type="gramEnd"/>
+      <w:r>
+        <w:rPr>
+          <w:lang w:val="en"/>
+        </w:rPr>
+        <w:t xml:space="preserve"> saves you a step on the ones that do.</w:t>
       </w:r>
     </w:p>
     <w:p>

</xml_diff>